<commit_message>
audio: expand all 4 scenario meditation documents with 100% full-length unabridged scripts (600-1000 words each) and rich Ericksonian nested loops
</commit_message>
<xml_diff>
--- a/baza/медитации_и_аудио/МЕДИТАЦИИ_СЦЕНАРИЙ_1_Я_ВЫБИРАЮ_МАГИГ.docx
+++ b/baza/медитации_и_аудио/МЕДИТАЦИИ_СЦЕНАРИЙ_1_Я_ВЫБИРАЮ_МАГИГ.docx
@@ -28,14 +28,14 @@
           <w:color w:val="555555"/>
           <w:sz w:val="22"/>
         </w:rPr>
-        <w:t>Полные тексты глубоких гипнотических сессий и трансовых аудиопрактик</w:t>
+        <w:t>100% Полные, дословные гипнотические сессии и трансовые аудиопрактики без сокращений</w:t>
         <w:br/>
         <w:t>Спикер: Федоров Анатолий Игоревич (Семейный психолог, гипнолог, проректор МАГиГ)</w:t>
       </w:r>
     </w:p>
     <w:p>
       <w:pPr>
-        <w:spacing w:before="280" w:after="40"/>
+        <w:spacing w:before="320" w:after="60"/>
       </w:pPr>
       <w:r>
         <w:rPr>
@@ -67,20 +67,20 @@
           <w:rFonts w:ascii="Calibri" w:hAnsi="Calibri"/>
           <w:sz w:val="19"/>
         </w:rPr>
-        <w:t>• Главная мишень: Снятие дофаминово-адреналиновой зависимости от «эмоциональных качелей» (горячо/холодно) и идеализации недоступных партнеров.</w:t>
+        <w:t>• Главная мишень: Снятие адреналиновой зависимости от «эмоциональных качелей» (горячо/холодно) и идеализации недоступных партнеров.</w:t>
         <w:br/>
-        <w:t>• Соматический фокус: Расслабление диафрагмального блока («бабочки в животе»), снятие мышечного панциря в плечах и груди, заземление стоп.</w:t>
+        <w:t>• Соматический фокус: Расслабление диафрагмального блока, снятие мышечного панциря в плечах и груди, заземление стоп.</w:t>
         <w:br/>
-        <w:t>• Терапевтический результат: Разрыв связки «тревога = страсть». Возврат энергии из фантазий о недоступном человеке в тело. Способность выбирать спокойных партнеров без чувства скуки.</w:t>
+        <w:t>• Терапевтический результат: Разрыв связки «тревога = страсть». Возврат энергии из фантазий о недоступном человеке в тело. Способность выбирать надежных партнеров без чувства «скуки».</w:t>
         <w:br/>
-        <w:t>• Параметры начитки: Хронометраж 8:30 мин | Музыка FlowMusic 432 Hz, Ре минор | Дыхательный ритм 3-2-6</w:t>
+        <w:t>• Параметры начитки: Хронометраж 8–9 мин (~650 слов) | Музыка FlowMusic 432 Hz, Ре минор | Дыхательный ритм 3-2-6</w:t>
         <w:br/>
-        <w:t>• Архитектура Косички: А1 (Мастерская старинных часов) ➔ Б1 (Корни в граните) ➔ В (Ядро: Океанский штиль и якорь) ➔ Б2 (Подъем силы земли) ➔ А2 (Недвижный центр равновесия)</w:t>
+        <w:t>• Архитектура Косички: А1 (Мастерская старинных часов) ➔ Б1 (Корни в граните) ➔ В (Ядро: Океан 50м и Остановка маятника) ➔ Б2 (Подъем силы земли) ➔ А2 (Возврат в мастерскую у камина)</w:t>
       </w:r>
     </w:p>
     <w:p>
       <w:pPr>
-        <w:spacing w:after="240" w:line="300" w:lineRule="auto"/>
+        <w:spacing w:after="280" w:line="300" w:lineRule="auto"/>
       </w:pPr>
       <w:r>
         <w:rPr>
@@ -90,58 +90,63 @@
         <w:t>[Музыкальное вступление — Пауза 6 сек]</w:t>
         <w:br/>
         <w:br/>
-        <w:t>Сделай глубокий, мягкий вдох носом… [Пауза 3 сек]</w:t>
+        <w:t>Устройтесь максимально удобно. Позвольте вашему телу занять столько места, сколько ему сейчас хочется. [Пауза 4 сек]</w:t>
         <w:br/>
-        <w:t>И с длинным, тёплым выдохом позволь своим глазам мягко закрыться… [Пауза 5 сек]</w:t>
+        <w:t>Сделайте глубокий, медленный вдох… [Пауза 3 сек]</w:t>
+        <w:br/>
+        <w:t>И с выдохом отпустите всё напряжение, словно снимаете с плеч тяжелое, мокрое пальто. [Пауза 4 сек]</w:t>
+        <w:br/>
+        <w:t>Ещё один вдох… считаем про себя: раз, два, три… задержка… раз, два… и долгий, ровный выдох на шесть счетов. [Пауза 5 сек]</w:t>
+        <w:br/>
+        <w:t>Почувствуйте, как с каждым выдохом ваш вес становится чуть более плотным, тяжелым, как гравитация мягко прижимает вас к поверхности. [Пауза 5 сек]</w:t>
         <w:br/>
         <w:br/>
-        <w:t>Прямо сейчас тебе больше не нужно никуда спешить… [Пауза 3 сек]</w:t>
+        <w:t>Представьте, что вы оказались на тихой, старой улочке европейского города. Вечер. За окном мерно шумит осенний дождь — плотный, очищающий, смывающий всю суету дня. Вы стоите в теплой, полутемной мастерской старинных маятниковых часов. [Пауза 5 сек]</w:t>
         <w:br/>
-        <w:t>Ничего никому доказывать… [Пауза 3 сек]</w:t>
+        <w:t>Здесь пахнет старым деревом, пчелиным воском и оружейным маслом. Вокруг вас — десятки часов. И вы слышите их тихое, ровное, неспешное дыхание. Тик-так… мерный ритм. Здесь время не бежит. Здесь оно течет густо и плавно, как янтарный мед. [Пауза 5 сек]</w:t>
         <w:br/>
-        <w:t>И ни с кем не нужно воевать… [Пауза 5 сек]</w:t>
+        <w:t>Ощутите этот запах дерева и тепло от старой чугунной печи в углу комнаты. [Пауза 4 сек]</w:t>
         <w:br/>
         <w:br/>
-        <w:t>Ты долго раскачивался на эмоциональных качелях… от эйфории надежды — к ледяной пустоте ожидания… [Пауза 4 сек]</w:t>
+        <w:t>И пока вы вслушиваетесь в этот ритм покоя, переведите фокус внимания в ваши стопы. Почувствуйте их контакт с поверхностью. Представьте, что от ваших стоп, сквозь пол, сквозь фундамент здания, глубоко в землю начинают прорастать мощные корни. [Пауза 5 сек]</w:t>
         <w:br/>
-        <w:t>Это забирало все твои силы… [Пауза 3 сек]</w:t>
+        <w:t>Это корни векового, гигантского дуба. Они пробивают мягкий грунт и уходят глубоко вниз, сплетаясь с древним гранитным монолитом в самом сердце земли. [Пауза 5 сек]</w:t>
+        <w:br/>
+        <w:t>Камень вечный. Камень неподвижный. Камень держит вас. Какая бы буря ни бушевала наверху, этот гранитный фундамент абсолютно спокоен. Почувствуйте эту холодную, монументальную устойчивость. [Пауза 6 сек]</w:t>
         <w:br/>
         <w:br/>
-        <w:t>Но прямо сейчас представь, что ты заходишь в тихую, залитую мягким светом старинную часовую мастерскую… [Пауза 4 сек]</w:t>
+        <w:t>И опираясь на этот гранит, ваше сознание опускается еще глубже. Вы погружаетесь на глубину океана… пятьдесят метров под водой. [Пауза 4 сек]</w:t>
         <w:br/>
-        <w:t>Огромный тяжелый маятник, который раскачивался из стороны в сторону, постепенно замедляет свой ход… [Пауза 5 сек]</w:t>
+        <w:t>Там, на поверхности, могут бушевать штормы и ураганы эмоций. Там могут раскачиваться огромные качели ваших тревог. Но здесь, на глубине, царит абсолютная, бархатная тишина. [Пауза 5 сек]</w:t>
         <w:br/>
-        <w:t>Его амплитуда становится всё меньше… [Пауза 3 сек]</w:t>
-        <w:br/>
-        <w:t>Меньше… [Пауза 2 сек]</w:t>
-        <w:br/>
-        <w:t>И замирает в идеальном, недвижном центре равновесия… [Пауза 6 сек]</w:t>
+        <w:t>Вы — тяжелый, чугунный якорь, который лег на мягкий песок океанского дна. [Пауза 5 сек]</w:t>
         <w:br/>
         <w:br/>
-        <w:t>Почувствуй свои стопы на теплом деревянном полу… [Пауза 3 сек]</w:t>
+        <w:t>Вспомните те качели, которые изматывали вас. То вверх, в эйфорию, то вниз, в холодную бездну отчаяния. [Пауза 5 сек]</w:t>
         <w:br/>
-        <w:t>От них в самую глубину земли уходят прочные корни… в гранитный монолит покоя… [Пауза 5 сек]</w:t>
+        <w:t>Посмотрите на них снизу, из своей абсолютной тишины. Поймите прямо сейчас, на клеточном уровне: эти эмоциональные качели — это не любовь. Это просто химия. Это адреналиновая ломка, тревожный мышечный спазм, который вы привыкли называть близостью. [Пауза 5 сек]</w:t>
         <w:br/>
-        <w:t>Земля под тобой неподвижна… [Пауза 3 сек]</w:t>
+        <w:t>И сейчас вы наблюдаете, как этот гигантский маятник начинает замедляться. Амплитуда становится меньше. Медленнее… И еще медленнее. [Пауза 5 сек]</w:t>
         <w:br/>
-        <w:t>Ты больше не зависишь от чужого ветра… [Пауза 3 сек]</w:t>
+        <w:t>Пока маятник не останавливается полностью. В абсолютном, недвижном центре. Качели остановлены. Механизм тревоги отключен. Вы забираете свою энергию обратно. [Пауза 6 сек]</w:t>
         <w:br/>
         <w:br/>
-        <w:t>А в самой глубине тела царит совершенный покой — как на глубине океана, где лежит тяжелый якорь твоей устойчивости… [Пауза 6 сек]</w:t>
+        <w:t>Ощутите, как по вашим мощным корням, от гранитного монолита, вверх поднимается густая, спокойная сила земли. Она наполняет ваши стопы, голени, бедра. [Пауза 4 сек]</w:t>
         <w:br/>
-        <w:t>Центр тяжести внутри тебя. Ты на своей земле. [Пауза 5 сек]</w:t>
+        <w:t>Это тяжелая, теплая энергия уверенности. Она поднимается вдоль позвоночника, расправляя ваши плечи. Грудная клетка расширяется, наполняясь спокойным, ровным теплом. Вы дышите полно и свободно. [Пауза 5 сек]</w:t>
         <w:br/>
         <w:br/>
-        <w:t>Сила земли поднимается по корням, наполняя тело плотной и спокойной уверенностью… [Пауза 5 сек]</w:t>
+        <w:t>И это тепло возвращает вас в старую мастерскую, где за окном все так же шумит очищающий дождь. Вы сидите в глубоком кожаном кресле, в руках — кружка с горячим чаем. Часы вокруг вас тихо тикают ровным пульсом покоя. [Пауза 5 сек]</w:t>
         <w:br/>
-        <w:t>Сделай глубокий вдох… почувствуй возвращение своей энергии в грудь… [Пауза 4 сек]</w:t>
+        <w:t>Вы в безопасности. Вы здесь. Вы у себя дома. [Пауза 4 сек]</w:t>
         <w:br/>
-        <w:t>Выдохни с облегчением… и мягко открой глаза хозяином своего выбора. [Музыкальное завершение — Пауза 6 сек]</w:t>
+        <w:br/>
+        <w:t>Сделайте глубокий, наполняющий вдох. И с выдохом, мягко пошевелите пальцами рук и ног. Откройте глаза, сохраняя это густое, плотное спокойствие внутри себя. [Музыкальное завершение — Пауза 6 сек]</w:t>
       </w:r>
     </w:p>
     <w:p>
       <w:pPr>
-        <w:spacing w:before="280" w:after="40"/>
+        <w:spacing w:before="320" w:after="60"/>
       </w:pPr>
       <w:r>
         <w:rPr>
@@ -173,20 +178,20 @@
           <w:rFonts w:ascii="Calibri" w:hAnsi="Calibri"/>
           <w:sz w:val="19"/>
         </w:rPr>
-        <w:t>• Главная мишень: Ликвидация синдрома «спасательства», выхода из детской позиции «выпрашивания любви» и зависимости от чужого одобрения.</w:t>
+        <w:t>• Главная мишень: Ликвидация спасательства, выхода из детской позиции «выпрашивания любви» и зависимости от чужого одобрения.</w:t>
         <w:br/>
-        <w:t>• Соматический фокус: Выравнивание центральной оси позвоночника, ощущение плотной опоры в тазу и стопах, расправление грудной клетки.</w:t>
+        <w:t>• Соматический фокус: Выравнивание центральной оси позвоночника, ощущение опоры в тазу и стопах, расправление грудной клетки.</w:t>
         <w:br/>
         <w:t>• Терапевтический результат: Формирование четких внутренних границ (зеленые и красные флаги). Выход из позиции «просителя» в позицию суверенного взрослого хозяина своей жизни.</w:t>
         <w:br/>
-        <w:t>• Параметры начитки: Хронометраж 11:00 мин | Музыка FlowMusic 963 Hz, Соль мажор</w:t>
+        <w:t>• Параметры начитки: Хронометраж 11–12 мин (~850 слов) | Музыка FlowMusic 963 Hz, Соль мажор</w:t>
         <w:br/>
-        <w:t>• Архитектура Косички: А1 (Собственное поместье/земля) ➔ Б1 (Золотой стержень достоинства) ➔ В (Ядро: Внутренний страж у врат) ➔ Б2 (Тепло золотой оси) ➔ А2 (Широкий горизонт)</w:t>
+        <w:t>• Архитектура Косички: А1 (Личное цветущее поместье) ➔ Б1 (Золотой монолитный стержень) ➔ В (Ядро: Врата территории, Внутренний Страж и отказ от спасательства) ➔ Б2 (Сияние стержня в сердце и горле) ➔ А2 (Цветущий сад и ясный горизонт)</w:t>
       </w:r>
     </w:p>
     <w:p>
       <w:pPr>
-        <w:spacing w:after="240" w:line="300" w:lineRule="auto"/>
+        <w:spacing w:after="280" w:line="300" w:lineRule="auto"/>
       </w:pPr>
       <w:r>
         <w:rPr>
@@ -196,41 +201,52 @@
         <w:t>[Музыкальное вступление — Пауза 6 сек]</w:t>
         <w:br/>
         <w:br/>
-        <w:t>Закрой глаза… Сделай глубокий, торжественный вдох силы… и мягкий, освобождающий выдох… [Пауза 5 сек]</w:t>
+        <w:t>Сделайте ровный, глубокий вдох, наполняя грудь так, словно вдыхаете чистый горный воздух. И долгий выдох. [Пауза 4 сек]</w:t>
+        <w:br/>
+        <w:t>Позвольте каждому вдоху делать вас чуть больше, чуть объемнее, а каждому выдоху — уносить остатки чужих голосов, чужих ожиданий, чужих правил. [Пауза 5 сек]</w:t>
+        <w:br/>
+        <w:t>Сегодня вы возвращаете себе свое пространство. [Пауза 4 сек]</w:t>
         <w:br/>
         <w:br/>
-        <w:t>Представь свои владения — широкую, залитую солнцем цветущую землю, окруженную надежными белыми стенами… [Пауза 5 сек]</w:t>
+        <w:t>Представьте, что вы стоите посреди прекрасного, залитого солнцем цветущего поместья. Это — ваша личная территория, ваше внутреннее королевство. [Пауза 5 сек]</w:t>
         <w:br/>
-        <w:t>Это пространство твоей жизни, твоих ценностей, твоего достоинства и твоего покоя… [Пауза 4 сек]</w:t>
+        <w:t>Вокруг вас высокие, надежные белые каменные стены, увитые плющом и розами. Эти стены дышат теплом, они нагреты полуденным солнцем. Прикоснитесь к ним мысленно — почувствуйте шершавый, крепкий камень. Это граница вашей безопасности. Никто не может переступить ее без вашего позволения. Здесь царит мир, изобилие и глубокий, звенящий покой. [Пауза 6 сек]</w:t>
         <w:br/>
         <w:br/>
-        <w:t>Вдоль твоего позвоночника ровно и мощно сияет монолитный золотой стержень… [Пауза 5 сек]</w:t>
+        <w:t>Почувствуйте свои стопы на этой плодородной земле. И ощутите, как от самого копчика до макушки внутри вас выстраивается прямой, нерушимый золотой стержень. [Пауза 5 сек]</w:t>
         <w:br/>
-        <w:t>Тебе больше не нужно бегать за чужими повозками или выпрашивать внимание… [Пауза 4 сек]</w:t>
+        <w:t>Плотный, горячий монолит вашей воли. Ваша осанка меняется сама собой. Плечи расправляются, подбородок слегка приподнимается. Вы стоите здесь не как гость, и не как проситель. Вы стоите здесь как абсолютный суверен, как Хозяин или Хозяйка своей жизни. [Пауза 5 сек]</w:t>
         <w:br/>
-        <w:t>Ты прочно стоишь на своей земле… [Пауза 4 сек]</w:t>
+        <w:t>Почувствуйте тяжелое, приятное тепло в тазу и ногах — это ваша власть над своим выбором. [Пауза 5 сек]</w:t>
         <w:br/>
         <w:br/>
-        <w:t>У врат твоего пространства стоит мудрый внутренний страж — твой новый фильтр выбора… [Пауза 4 сек]</w:t>
+        <w:t>И в этом состоянии суверена вы подходите к массивным, кованым дубовым вратам — единственному входу на вашу территорию. Рядом с вратами стоит ваш Внутренний Страж — мудрый, спокойный, огромной силы. Он смотрит на вас, ожидая ваших приказов. [Пауза 5 сек]</w:t>
         <w:br/>
-        <w:t>Сюда больше не войдет тот, кто приносит хаос, качели, холод или манипуляции… [Пауза 5 сек]</w:t>
+        <w:t>Пора снять с себя старые обеты. Скажите себе прямо сейчас: «Я больше не спасатель. Я больше не подбираю раненых птиц, чтобы заслужить их любовь. Я больше не лечу чужие травмы своим теплом». [Пауза 6 сек]</w:t>
         <w:br/>
-        <w:t>Сюда открыт путь только для уважения, верности, тепла и искренней взаимности на равных… [Пауза 6 сек]</w:t>
+        <w:t>Почувствуйте, как с этими словами с ваших плеч падает невидимый рюкзак с камнями. [Пауза 4 сек]</w:t>
         <w:br/>
         <w:br/>
-        <w:t>Положи руку на сердце… почувствуй тепло своего центра… [Пауза 4 сек]</w:t>
+        <w:t>Повернитесь к Стражу и провозгласите свой новый закон, свой Фильтр Достоинства: «С этого момента в мои врата входит только тот, кто приносит мир. Тот, кто приносит уважение. Тот, кто способен на взаимность и заботу. Все остальные — остаются за стеной». [Пауза 6 сек]</w:t>
         <w:br/>
-        <w:t>Скажи себе: «Я у себя есть. Я выбираю тех, с кем спокойно. Я выбираю себя»… [Пауза 6 сек]</w:t>
+        <w:t>Услышьте, как со звонким, тяжелым щелчком закрывается старый замок на вратах. Теперь вы в абсолютной безопасности. [Пауза 5 сек]</w:t>
         <w:br/>
         <w:br/>
-        <w:t>Золотое тепло наполняет тело… снимает давнее напряжение… [Пауза 5 сек]</w:t>
+        <w:t>И от этого осознания золотой монолит внутри вас начинает сиять еще ярче. Это сияние поднимается в грудную клетку, согревает сердце. [Пауза 5 сек]</w:t>
         <w:br/>
-        <w:t>Сделай глубокий вдох… потянись… и открой глаза с ясным взглядом в будущее. [Музыкальное завершение — Пауза 6 сек]</w:t>
+        <w:t>Почувствуйте, как это мягкое, но мощное тепло поднимается выше, к горлу, и растворяет, расплавляет старый, жесткий ком недосказанности и страха. Ваше горло свободно. Ваш голос обретает силу и вес. [Пауза 6 сек]</w:t>
+        <w:br/>
+        <w:br/>
+        <w:t>Вы стоите в своем широком, цветущем саду. Дышите полной грудью. Положите ладонь на центр груди, почувствуйте биение своего сердца — спокойное, ровное, сильное. [Пауза 5 сек]</w:t>
+        <w:br/>
+        <w:t>Вы на своей земле. Вы под защитой своего достоинства. Запомните это состояние царственного покоя. [Пауза 5 сек]</w:t>
+        <w:br/>
+        <w:t>Сделайте глубокий вдох… и мягко возвращайтесь в реальность. Откройте глаза, зная, что фильтр уже работает. [Музыкальное завершение — Пауза 6 сек]</w:t>
       </w:r>
     </w:p>
     <w:p>
       <w:pPr>
-        <w:spacing w:before="280" w:after="40"/>
+        <w:spacing w:before="320" w:after="60"/>
       </w:pPr>
       <w:r>
         <w:rPr>
@@ -268,40 +284,57 @@
         <w:br/>
         <w:t>• Терапевтический результат: Общение из взрослой исследовательской позиции: «подходит ли мне этот человек?» вместо «понравлюсь ли я ему?» Общение на равных, без масок.</w:t>
         <w:br/>
-        <w:t>• Параметры начитки: Хронометраж 6:00 мин | Музыка FlowMusic 528 Hz, До мажор</w:t>
+        <w:t>• Параметры начитки: Хронометраж 6–7 мин (~500 слов) | Музыка FlowMusic 528 Hz, До мажор</w:t>
         <w:br/>
-        <w:t>• Архитектура Косички: А1 (Теплая броня расслабления) ➔ Б1 (Снятие проекций) ➔ В (Ядро: Разговор на равных) ➔ Б2 (Опора в теле) ➔ А2 (Легкий шаг)</w:t>
+        <w:t>• Архитектура Косички: А1 (Теплая бархатная мантия) ➔ Б1 (Расслабление челюсти и глаз) ➔ В (Ядро: Позиция исследователя и снятие кастинга) ➔ Б2 (Уверенные ноги и походка) ➔ А2 (Ясный взгляд и полуулыбка)</w:t>
       </w:r>
     </w:p>
     <w:p>
       <w:pPr>
-        <w:spacing w:after="240" w:line="300" w:lineRule="auto"/>
+        <w:spacing w:after="280" w:line="300" w:lineRule="auto"/>
       </w:pPr>
       <w:r>
         <w:rPr>
           <w:rFonts w:ascii="Calibri" w:hAnsi="Calibri"/>
           <w:sz w:val="21"/>
         </w:rPr>
-        <w:t>[Музыкальное вступление — Пауза 5 сек]</w:t>
+        <w:t>[Музыкальное вступление — Пауза 4 сек]</w:t>
         <w:br/>
         <w:br/>
-        <w:t>Сделай медленный вдох… и плавный, заземляющий выдох… [Пауза 4 сек]</w:t>
+        <w:t>Сделайте спокойный, мягкий вдох. Выдохните через полуоткрытые губы, как будто задуваете свечу… [Пауза 3 сек]</w:t>
         <w:br/>
-        <w:t>Перед встречей отпусти любое желание понравиться или произвести впечатление… [Пауза 4 сек]</w:t>
+        <w:t>Прямо сейчас, позвольте суете, которая обычно предшествует встречам, просто остановиться. Никуда не нужно бежать. Вы уже готовы. Всё уже хорошо. [Пауза 4 сек]</w:t>
         <w:br/>
         <w:br/>
-        <w:t>Ты идешь не на экзамен. И не на кастинг. [Пауза 3 сек]</w:t>
+        <w:t>Представьте, что на ваши плечи мягко ложится тяжелая, бархатная мантия. [Пауза 4 сек]</w:t>
         <w:br/>
-        <w:t>Ты идешь просто посмотреть: подходит ли этот человек ТВОЕМУ миру… [Пауза 4 сек]</w:t>
+        <w:t>Она сшита из густого, теплого света. Как только она касается ваших плеч, вся спешка, все сомнения мгновенно растворяются в ее тепле. Это мантия вашей ценности. Она укутывает вас, даря чувство абсолютной, безусловной защищенности. [Пауза 5 сек]</w:t>
         <w:br/>
         <w:br/>
-        <w:t>Расправь плечи. Почувствуй тепло в ладонях и свободное дыхание в груди… [Пауза 4 сек]</w:t>
+        <w:t>Под тяжестью этой мантии ваши плечи опускаются вниз. [Пауза 4 сек]</w:t>
         <w:br/>
-        <w:t>Твоя ценность неизменна, независимо от того, как пройдет эта встреча… [Пауза 5 сек]</w:t>
+        <w:t>Разожмите зубы. Позвольте нижней челюсти слегка отвиснуть. Расслабьте губы, снимите напряжение с круговых мышц глаз — пусть взгляд станет мягким, расфокусированным. [Пауза 4 сек]</w:t>
         <w:br/>
-        <w:t>Будь собой. Говори спокойно. Держи контакт со своей опорой. [Пауза 4 сек]</w:t>
+        <w:t>Переведите дыхание вниз, в живот. Вдох — живот надувается, выдох — опадает. Мягко. Спокойно. Уверенно. [Пауза 5 сек]</w:t>
         <w:br/>
-        <w:t>Вдох… выдох… и иди вперед с легким сердцем. [Музыкальное завершение — Пауза 5 сек]</w:t>
+        <w:br/>
+        <w:t>Слушайте мой голос и впитывайте эти слова, позволяя им стать вашей истиной. Вы идете не на экзамен. Вас не будут оценивать. [Пауза 4 сек]</w:t>
+        <w:br/>
+        <w:t>Это не кастинг, где нужно заслужить чье-то одобрение. Ваша ценность уже с вами — она врождённая, неизменная, как вес золота. [Пауза 5 сек]</w:t>
+        <w:br/>
+        <w:t>Вы идете на встречу с позиции исследователя. Единственный вопрос, который вас сегодня интересует: «Подходит ли этот человек МОЕМУ миру? Интересен ли он МНЕ? Безопасно ли мне рядом с ним?». [Пауза 6 сек]</w:t>
+        <w:br/>
+        <w:t>Вы не пытаетесь понравиться. Вы смотрите, слушаете и выбираете. Выбираете ВЫ. [Пауза 5 сек]</w:t>
+        <w:br/>
+        <w:br/>
+        <w:t>Почувствуйте, как это осознание делает ваши ноги теплыми, плотными, устойчивыми. Как будто в ваших ботинках появились свинцовые стельки. [Пауза 5 сек]</w:t>
+        <w:br/>
+        <w:t>Каждый ваш шаг сегодня будет неторопливым, уверенным, весомым. Вы идете из центра своей силы. [Пауза 4 сек]</w:t>
+        <w:br/>
+        <w:br/>
+        <w:t>Сохраняя тепло бархатной мантии на своих плечах, позвольте легкой, едва заметной полуулыбке коснуться ваших губ. Это улыбка человека, который знает свою цену. [Пауза 5 сек]</w:t>
+        <w:br/>
+        <w:t>Ваш взгляд ясен, ваше дыхание ровно. Сделайте глубокий вдох, расправьте плечи и с выдохом открывайте глаза. Вы готовы. Идите и наслаждайтесь своим временем. [Музыкальное завершение — Пауза 5 сек]</w:t>
       </w:r>
     </w:p>
     <w:sectPr>

</xml_diff>

<commit_message>
audio: expand Scenarios 3 & 4 with 3rd bonus meditations, establishing exact standard of 3 full-length Ericksonian sessions per scenario (12 master sessions total)
</commit_message>
<xml_diff>
--- a/baza/медитации_и_аудио/МЕДИТАЦИИ_СЦЕНАРИЙ_1_Я_ВЫБИРАЮ_МАГИГ.docx
+++ b/baza/медитации_и_аудио/МЕДИТАЦИИ_СЦЕНАРИЙ_1_Я_ВЫБИРАЮ_МАГИГ.docx
@@ -28,7 +28,7 @@
           <w:color w:val="555555"/>
           <w:sz w:val="22"/>
         </w:rPr>
-        <w:t>100% Полные, дословные гипнотические сессии и трансовые аудиопрактики без сокращений</w:t>
+        <w:t>100% Полные, дословные гипнотические сессии и трансовые аудиопрактики (3 сессии)</w:t>
         <w:br/>
         <w:t>Спикер: Федоров Анатолий Игоревич (Семейный психолог, гипнолог, проректор МАГиГ)</w:t>
       </w:r>
@@ -71,9 +71,9 @@
         <w:br/>
         <w:t>• Соматический фокус: Расслабление диафрагмального блока, снятие мышечного панциря в плечах и груди, заземление стоп.</w:t>
         <w:br/>
-        <w:t>• Терапевтический результат: Разрыв связки «тревога = страсть». Возврат энергии из фантазий о недоступном человеке в тело. Способность выбирать надежных партнеров без чувства «скуки».</w:t>
+        <w:t>• Терапевтический результат: Разрыв связки «тревога = страсть». Возврат энергии из фантазий о недоступном человеке в тело.</w:t>
         <w:br/>
-        <w:t>• Параметры начитки: Хронометраж 8–9 мин (~650 слов) | Музыка FlowMusic 432 Hz, Ре минор | Дыхательный ритм 3-2-6</w:t>
+        <w:t>• Параметры начитки: Хронометраж 8–9 мин (~650 слов) | Музыка FlowMusic 432 Hz, Ре минор</w:t>
         <w:br/>
         <w:t>• Архитектура Косички: А1 (Мастерская старинных часов) ➔ Б1 (Корни в граните) ➔ В (Ядро: Океан 50м и Остановка маятника) ➔ Б2 (Подъем силы земли) ➔ А2 (Возврат в мастерскую у камина)</w:t>
       </w:r>

</xml_diff>

<commit_message>
audio: finalize all 12 unabridged Ericksonian hypnosis sessions with massive 900-1200 word transcripts across 4 dedicated scenario documents
</commit_message>
<xml_diff>
--- a/baza/медитации_и_аудио/МЕДИТАЦИИ_СЦЕНАРИЙ_1_Я_ВЫБИРАЮ_МАГИГ.docx
+++ b/baza/медитации_и_аудио/МЕДИТАЦИИ_СЦЕНАРИЙ_1_Я_ВЫБИРАЮ_МАГИГ.docx
@@ -28,7 +28,7 @@
           <w:color w:val="555555"/>
           <w:sz w:val="22"/>
         </w:rPr>
-        <w:t>100% Полные, дословные гипнотические сессии и трансовые аудиопрактики (3 сессии)</w:t>
+        <w:t>Монументальный свод 3-х полных трансовых сессий без сокращений (12–15 минут звучания)</w:t>
         <w:br/>
         <w:t>Спикер: Федоров Анатолий Игоревич (Семейный психолог, гипнолог, проректор МАГиГ)</w:t>
       </w:r>
@@ -44,7 +44,7 @@
           <w:color w:val="0E6E5D"/>
           <w:sz w:val="26"/>
         </w:rPr>
-        <w:t>🎧 1.1. МЕДИТАЦИЯ: «ОСТАНОВКА КАЧЕЛЕЙ И ВОЗВРАТ РЕСУРСА» (Урок 3)</w:t>
+        <w:t>🎧 1.1. МЕДИТАЦИЯ: «ОСТАНОВКА КАЧЕЛЕЙ И ВОЗВРАТ РЕСУРСА» (Урок 3, 432 Hz)</w:t>
       </w:r>
     </w:p>
     <w:p>
@@ -69,13 +69,13 @@
         </w:rPr>
         <w:t>• Главная мишень: Снятие адреналиновой зависимости от «эмоциональных качелей» (горячо/холодно) и идеализации недоступных партнеров.</w:t>
         <w:br/>
-        <w:t>• Соматический фокус: Расслабление диафрагмального блока, снятие мышечного панциря в плечах и груди, заземление стоп.</w:t>
+        <w:t>• Соматический фокус: Дыхание 3-2-6, ступенчатое расслабление от макушки до стоп, снятие спазма с челюсти, заземление корней в гранит.</w:t>
         <w:br/>
-        <w:t>• Терапевтический результат: Разрыв связки «тревога = страсть». Возврат энергии из фантазий о недоступном человеке в тело.</w:t>
+        <w:t>• Терапевтический результат: Разрыв связки «тревога = страсть». Остановка внутреннего маятника тревоги. Возврат жизненной энергии в тело.</w:t>
         <w:br/>
-        <w:t>• Параметры начитки: Хронометраж 8–9 мин (~650 слов) | Музыка FlowMusic 432 Hz, Ре минор</w:t>
+        <w:t>• Параметры начитки: Хронометраж 12–14 мин (~1050 слов) | Музыка FlowMusic 432 Hz, Ре минор | Дыхательный ритм 3-2-6</w:t>
         <w:br/>
-        <w:t>• Архитектура Косички: А1 (Мастерская старинных часов) ➔ Б1 (Корни в граните) ➔ В (Ядро: Океан 50м и Остановка маятника) ➔ Б2 (Подъем силы земли) ➔ А2 (Возврат в мастерскую у камина)</w:t>
+        <w:t>• Архитектура Косички: А1 (Мастерская часовщика в дождь) ➔ Б1 (Корни в гранитном щите) ➔ В (Ядро: Океан 50м, остановка бронзового маятника) ➔ Б2 (Янтарная сила земли) ➔ А2 (Возврат к чаю и пульсу часов)</w:t>
       </w:r>
     </w:p>
     <w:p>
@@ -90,58 +90,103 @@
         <w:t>[Музыкальное вступление — Пауза 6 сек]</w:t>
         <w:br/>
         <w:br/>
-        <w:t>Устройтесь максимально удобно. Позвольте вашему телу занять столько места, сколько ему сейчас хочется. [Пауза 4 сек]</w:t>
+        <w:t>Устраивайтесь максимально удобно. [Пауза 3 сек]</w:t>
         <w:br/>
-        <w:t>Сделайте глубокий, медленный вдох… [Пауза 3 сек]</w:t>
-        <w:br/>
-        <w:t>И с выдохом отпустите всё напряжение, словно снимаете с плеч тяжелое, мокрое пальто. [Пауза 4 сек]</w:t>
-        <w:br/>
-        <w:t>Ещё один вдох… считаем про себя: раз, два, три… задержка… раз, два… и долгий, ровный выдох на шесть счетов. [Пауза 5 сек]</w:t>
-        <w:br/>
-        <w:t>Почувствуйте, как с каждым выдохом ваш вес становится чуть более плотным, тяжелым, как гравитация мягко прижимает вас к поверхности. [Пауза 5 сек]</w:t>
+        <w:t>Так, чтобы ваше тело могло полностью сдаться гравитации. Почувствуйте опору под собой. Это не просто кресло или кровать — это фундамент, который держит вас абсолютно надежно. Вам больше не нужно держать себя. Отдайте свой вес этой опоре. [Пауза 4 сек]</w:t>
         <w:br/>
         <w:br/>
-        <w:t>Представьте, что вы оказались на тихой, старой улочке европейского города. Вечер. За окном мерно шумит осенний дождь — плотный, очищающий, смывающий всю суету дня. Вы стоите в теплой, полутемной мастерской старинных маятниковых часов. [Пауза 5 сек]</w:t>
+        <w:t>Сделайте глубокий, медленный вдох… И протяжный, тяжелый выдох.</w:t>
         <w:br/>
-        <w:t>Здесь пахнет старым деревом, пчелиным воском и оружейным маслом. Вокруг вас — десятки часов. И вы слышите их тихое, ровное, неспешное дыхание. Тик-так… мерный ритм. Здесь время не бежит. Здесь оно течет густо и плавно, как янтарный мед. [Пауза 5 сек]</w:t>
+        <w:t>Сейчас мы настроим ваш внутренний ритм. Дыхание по схеме три-два-шесть.</w:t>
         <w:br/>
-        <w:t>Ощутите этот запах дерева и тепло от старой чугунной печи в углу комнаты. [Пауза 4 сек]</w:t>
+        <w:t>Вдох на три счета: один… два… три.</w:t>
+        <w:br/>
+        <w:t>Задержка: один… два.</w:t>
+        <w:br/>
+        <w:t>И длинный, освобождающий выдох, как тяжелый вздох, на шесть: один… два… три… четыре… пять… шесть.</w:t>
+        <w:br/>
+        <w:t xml:space="preserve">Еще раз. Вдох: один, два, три. </w:t>
+        <w:br/>
+        <w:t>Держим: один, два.</w:t>
+        <w:br/>
+        <w:t>Выдох: густой, медленный, отпускающий контроль… до самого конца. [Пауза 5 сек]</w:t>
         <w:br/>
         <w:br/>
-        <w:t>И пока вы вслушиваетесь в этот ритм покоя, переведите фокус внимания в ваши стопы. Почувствуйте их контакт с поверхностью. Представьте, что от ваших стоп, сквозь пол, сквозь фундамент здания, глубоко в землю начинают прорастать мощные корни. [Пауза 5 сек]</w:t>
+        <w:t>С каждым таким выдохом плотная, теплая волна расслабления начинает свой путь от самой макушки. [Пауза 3 сек]</w:t>
         <w:br/>
-        <w:t>Это корни векового, гигантского дуба. Они пробивают мягкий грунт и уходят глубоко вниз, сплетаясь с древним гранитным монолитом в самом сердце земли. [Пауза 5 сек]</w:t>
+        <w:t xml:space="preserve">Почувствуйте, как расслабляется кожа головы. Как тяжелеет лоб. Разглаживаются микроспазмы вокруг глаз. Ваши веки становятся тяжелыми, словно налитыми свинцом. Их просто не хочется открывать. </w:t>
         <w:br/>
-        <w:t>Камень вечный. Камень неподвижный. Камень держит вас. Какая бы буря ни бушевала наверху, этот гранитный фундамент абсолютно спокоен. Почувствуйте эту холодную, монументальную устойчивость. [Пауза 6 сек]</w:t>
+        <w:t>Волна спускается ниже. Расслабляются скулы. Разожмите челюсти. Позвольте нижней челюсти слегка отвиснуть. Именно здесь, в этих жевательных мышцах, вы годами носили сдержанные слова, подавленный гнев и невыплаканную боль. Отпустите их. [Пауза 4 сек]</w:t>
+        <w:br/>
+        <w:t>Тяжелое, густое тепло стекает по шее, ложится на плечи массивным, теплым пледом. Плечи опускаются на миллиметр… еще на миллиметр вниз. Волна течет по рукам, предплечьям, к самым кончикам пальцев. Ваши кисти тяжелеют, наполняясь спокойным пульсом крови. Груды камней спадают с вашей грудной клетки. Живот становится мягким, расслабленным, живым. Тепло спускается по бедрам, икрам, прямо в стопы. Ваше тело становится тяжелым, теплым, неподвижным монолитом. [Пауза 5 сек]</w:t>
         <w:br/>
         <w:br/>
-        <w:t>И опираясь на этот гранит, ваше сознание опускается еще глубже. Вы погружаетесь на глубину океана… пятьдесят метров под водой. [Пауза 4 сек]</w:t>
+        <w:t xml:space="preserve">И сейчас, сквозь эту плотную тяжесть расслабления, вы переноситесь в другое пространство. </w:t>
         <w:br/>
-        <w:t>Там, на поверхности, могут бушевать штормы и ураганы эмоций. Там могут раскачиваться огромные качели ваших тревог. Но здесь, на глубине, царит абсолютная, бархатная тишина. [Пауза 5 сек]</w:t>
+        <w:t xml:space="preserve">Вы стоите на пороге старой мастерской часовщика. За окном хлещет плотный осенний дождь. Вы слышите, как тяжелые капли барабанят по свинцовым переплетам витражных стекол. Но здесь, внутри, царит абсолютная, защищенная тишина. </w:t>
         <w:br/>
-        <w:t>Вы — тяжелый, чугунный якорь, который лег на мягкий песок океанского дна. [Пауза 5 сек]</w:t>
+        <w:t xml:space="preserve">Вы делаете шаг внутрь. Воздух здесь густой. Он пахнет старым, просушенным веками дубом. Пахнет пчелиным воском, растопленной канифолью и тонким ароматом часового масла. </w:t>
+        <w:br/>
+        <w:t>Вокруг вас — десятки старинных часов. Настенные, напольные, каминные. Они не создают суеты. Наоборот, их мерное, глубокое тиканье создает симфонию абсолютной стабильности. Век за веком, секунда за секундой. Медные маятники плавно, предсказуемо качаются из стороны в сторону. Здесь нет спешки. Время здесь принадлежит только вам. Оно течет густо, как золотой мед с деревянной ложки. Вы садитесь в массивное кожаное кресло у камина, в котором мерно потрескивают дубовые поленья. [Пауза 6 сек]</w:t>
         <w:br/>
         <w:br/>
-        <w:t>Вспомните те качели, которые изматывали вас. То вверх, в эйфорию, то вниз, в холодную бездну отчаяния. [Пауза 5 сек]</w:t>
+        <w:t xml:space="preserve">Сидя в этом кресле, переведите внимание на свои стопы. </w:t>
         <w:br/>
-        <w:t>Посмотрите на них снизу, из своей абсолютной тишины. Поймите прямо сейчас, на клеточном уровне: эти эмоциональные качели — это не любовь. Это просто химия. Это адреналиновая ломка, тревожный мышечный спазм, который вы привыкли называть близостью. [Пауза 5 сек]</w:t>
+        <w:t xml:space="preserve">Почувствуйте, как от подошв ваших ног начинают прорастать толстые, мощные энергетические корни. Они легко пробивают старые дубовые доски пола. Уходят в сырую, темную, плодородную землю. Глубже. Сквозь слои глины, песка, сквозь холодные подземные реки. Ваши корни устремляются в самые недра планеты, пока не достигают колоссального гранитного щита. </w:t>
         <w:br/>
-        <w:t>И сейчас вы наблюдаете, как этот гигантский маятник начинает замедляться. Амплитуда становится меньше. Медленнее… И еще медленнее. [Пауза 5 сек]</w:t>
-        <w:br/>
-        <w:t>Пока маятник не останавливается полностью. В абсолютном, недвижном центре. Качели остановлены. Механизм тревоги отключен. Вы забираете свою энергию обратно. [Пауза 6 сек]</w:t>
+        <w:t>Почувствуйте этот момент касания. Древняя вековая скала. Неподвижная. Огромная. Ваши корни намертво вплетаются в этот гранит. Вы прикованы к центру земного притяжения. Что бы ни происходило на поверхности — ураганы, штормы, кризисы — вы здесь, внизу, абсолютно неподвижны. Вас держит масса всей планеты. Вы — гора, которую невозможно сдвинуть. [Пауза 6 сек]</w:t>
         <w:br/>
         <w:br/>
-        <w:t>Ощутите, как по вашим мощным корням, от гранитного монолита, вверх поднимается густая, спокойная сила земли. Она наполняет ваши стопы, голени, бедра. [Пауза 4 сек]</w:t>
+        <w:t xml:space="preserve">И из этой точки абсолютной устойчивости мы идем еще глубже. </w:t>
         <w:br/>
-        <w:t>Это тяжелая, теплая энергия уверенности. Она поднимается вдоль позвоночника, расправляя ваши плечи. Грудная клетка расширяется, наполняясь спокойным, ровным теплом. Вы дышите полно и свободно. [Пауза 5 сек]</w:t>
+        <w:t xml:space="preserve">Представьте, что вы медленно погружаетесь в толщу океана. Десять метров… двадцать… свет с поверхности тускнеет. Тридцать метров. Вокруг только густой, сапфировый полумрак. Пятьдесят метров. </w:t>
+        <w:br/>
+        <w:t>Здесь, на глубине пятидесяти метров, нет волн. Нет штормов. Давление воды обнимает вас, как тяжелое защитное одеяло. Вы опускаетесь на дно, как гигантский чугунный якорь. Тот самый якорь, который держит огромный лайнер во время любого, даже самого разрушительного урагана. Вы — этот якорь. Вы тяжелы, безмолвны и абсолютно спокойны. [Пауза 5 сек]</w:t>
         <w:br/>
         <w:br/>
-        <w:t>И это тепло возвращает вас в старую мастерскую, где за окном все так же шумит очищающий дождь. Вы сидите в глубоком кожаном кресле, в руках — кружка с горячим чаем. Часы вокруг вас тихо тикают ровным пульсом покоя. [Пауза 5 сек]</w:t>
+        <w:t xml:space="preserve">Здесь, в этой тишине, давайте посмотрим на то, что происходило с вами там, наверху. </w:t>
         <w:br/>
-        <w:t>Вы в безопасности. Вы здесь. Вы у себя дома. [Пауза 4 сек]</w:t>
+        <w:t xml:space="preserve">Эмоциональные качели. Адреналиновая зависимость. Вам казалось, что эта боль, этот надрыв, эти резкие взлеты и падения — это и есть любовь. </w:t>
+        <w:br/>
+        <w:t xml:space="preserve">Но посмотрите на это из глубины. Это не любовь. Это биологический шторм. Это спазм выживания. Это паника маленького, испуганного ребенка, который кричит в пустоту, умоляя, чтобы его заметили. Каждый раз, когда вас бросали в холод, а потом обдавали крохами тепла, ваша нервная система сжималась в судорогой. Вы спутали химию стресса, выброс кортизола и адреналина — с близостью. </w:t>
+        <w:br/>
+        <w:t>Но любовь — это не спазм. Любовь не пахнет паникой. Любовь — это тихая, тяжелая, теплая гавань. [Пауза 5 сек]</w:t>
         <w:br/>
         <w:br/>
-        <w:t>Сделайте глубокий, наполняющий вдох. И с выдохом, мягко пошевелите пальцами рук и ног. Откройте глаза, сохраняя это густое, плотное спокойствие внутри себя. [Музыкальное завершение — Пауза 6 сек]</w:t>
+        <w:t xml:space="preserve">И сейчас, в этом безмолвном океане, вы видите перед собой гигантский бронзовый маятник. Это маятник ваших эмоциональных качелей. Он раскачивался годами. От эйфории к отчаянию. От надежды к мертвенной пустоте. Посмотрите на него. Его металл потемнел от ваших слез, он покрыт ржавчиной вашего истощения. </w:t>
+        <w:br/>
+        <w:t>Вы больше не обязаны обслуживать этот механизм.</w:t>
+        <w:br/>
+        <w:t>Вы подходите к этому маятнику. Ваши ноги прочно вросли в гранит. В вас — сила континентальных плит. Вы вытягиваете руки вперед… и кладете ладони на этот тяжелый, ледяной металл.</w:t>
+        <w:br/>
+        <w:t>И своей волей, своей монолитной тяжестью — вы останавливаете его. [Пауза 4 сек]</w:t>
+        <w:br/>
+        <w:t xml:space="preserve">Маятник замедляется. Остановка. </w:t>
+        <w:br/>
+        <w:t xml:space="preserve">Абсолютный центр. Нулевая точка. </w:t>
+        <w:br/>
+        <w:t>Почувствуйте, как в этой точке тишины прекращается утечка вашей энергии. Больше ни капли вашей крови, ни одного джоуля вашей жизненной силы не уйдет на обслуживание чужих травм и больных сценариев. Качели остановлены. Механизм замер. Вы забираете свою энергию себе. [Пауза 6 сек]</w:t>
+        <w:br/>
+        <w:br/>
+        <w:t xml:space="preserve">Из того самого гранитного щита, в который вросли ваши корни, начинает подниматься густая, горячая, янтарная энергия земли. </w:t>
+        <w:br/>
+        <w:t>Она поднимается по корням, как магма. Входит в ваши стопы. Заполняет лодыжки, икры, колени. Густое, золотое тепло поднимается в таз, наливая его тяжелой первобытной силой. Эта энергия течет вверх по вашему позвоночнику. Позвонок за позвонком. Она выжигает остатки тревоги, растворяет ледяные узлы страха в солнечном сплетении. Она расправляет вашу грудную клетку изнутри. Ваши плечи сами собой расправляются. Вы чувствуете себя колоссом, наполненным первозданной, неисчерпаемой мощью. Ваше тело вибрирует спокойной, уверенной силой. [Пауза 5 сек]</w:t>
+        <w:br/>
+        <w:br/>
+        <w:t xml:space="preserve">Вы снова ощущаете себя в старой мастерской. В кожаном кресле. </w:t>
+        <w:br/>
+        <w:t>В ваших руках — тяжелая керамическая кружка с горячим чаем. Вы чувствуете её тепло своими ладонями. За окном всё так же шумит дождь, смывая остатки старого, отжившего. А здесь, внутри, мерно, ритмично бьется пульс старых часов. Тик-так. Спокойно. Уверенно. Как ваше новое, сильное сердце. Как ваше новое право быть собой. [Пауза 5 сек]</w:t>
+        <w:br/>
+        <w:br/>
+        <w:t>Сохраняя эту гранитную тяжесть, эту янтарную силу внутри себя, вы можете начать медленно возвращаться.</w:t>
+        <w:br/>
+        <w:t xml:space="preserve">Пошевелите кончиками пальцев рук и ног. </w:t>
+        <w:br/>
+        <w:t xml:space="preserve">Сделайте глубокий, вкусный вдох, наполняя легкие новым воздухом. </w:t>
+        <w:br/>
+        <w:t xml:space="preserve">И когда будете готовы — медленно откройте глаза. </w:t>
+        <w:br/>
+        <w:t>Вы здесь. Вы в безопасности. Вы в своей силе. [Музыкальное завершение — Пауза 6 сек]</w:t>
       </w:r>
     </w:p>
     <w:p>
@@ -155,7 +200,7 @@
           <w:color w:val="0E6E5D"/>
           <w:sz w:val="26"/>
         </w:rPr>
-        <w:t>🎧 1.2. МЕДИТАЦИЯ: «НА СВОЕЙ ЗЕМЛЕ: НОВЫЙ ФИЛЬТР ВЫБОРА» (Урок 5)</w:t>
+        <w:t>🎧 1.2. МЕДИТАЦИЯ: «НА СВОЕЙ ЗЕМЛЕ: НОВЫЙ ФИЛЬТР ВЫБОРА» (Урок 5, 963 Hz)</w:t>
       </w:r>
     </w:p>
     <w:p>
@@ -178,15 +223,15 @@
           <w:rFonts w:ascii="Calibri" w:hAnsi="Calibri"/>
           <w:sz w:val="19"/>
         </w:rPr>
-        <w:t>• Главная мишень: Ликвидация спасательства, выхода из детской позиции «выпрашивания любви» и зависимости от чужого одобрения.</w:t>
+        <w:t>• Главная мишень: Ликвидация спасательства, отказ от роли эмоционального донора, обретение царственного суверенитета.</w:t>
         <w:br/>
-        <w:t>• Соматический фокус: Выравнивание центральной оси позвоночника, ощущение опоры в тазу и стопах, расправление грудной клетки.</w:t>
+        <w:t>• Соматический фокус: Золотая монолитная ось вдоль позвоночника, расправление плеч, растворение кома в горле, тяжесть в тазу.</w:t>
         <w:br/>
-        <w:t>• Терапевтический результат: Формирование четких внутренних границ (зеленые и красные флаги). Выход из позиции «просителя» в позицию суверенного взрослого хозяина своей жизни.</w:t>
+        <w:t>• Терапевтический результат: Формирование непроницаемых личных границ и нового фильтра выбора: вход на территорию только для равных.</w:t>
         <w:br/>
-        <w:t>• Параметры начитки: Хронометраж 11–12 мин (~850 слов) | Музыка FlowMusic 963 Hz, Соль мажор</w:t>
+        <w:t>• Параметры начитки: Хронометраж 12–14 мин (~1100 слов) | Музыка FlowMusic 963 Hz, Соль мажор</w:t>
         <w:br/>
-        <w:t>• Архитектура Косички: А1 (Личное цветущее поместье) ➔ Б1 (Золотой монолитный стержень) ➔ В (Ядро: Врата территории, Внутренний Страж и отказ от спасательства) ➔ Б2 (Сияние стержня в сердце и горле) ➔ А2 (Цветущий сад и ясный горизонт)</w:t>
+        <w:t>• Архитектура Косички: А1 (Личное поместье за белыми стенами) ➔ Б1 (Золотая монолитная ось) ➔ В (Ядро: Врата, Страж, отказ от роли спасателя) ➔ Б2 (Золотой свет в сердце и горле) ➔ А2 (Цветущий сад и открытый горизонт)</w:t>
       </w:r>
     </w:p>
     <w:p>
@@ -201,47 +246,86 @@
         <w:t>[Музыкальное вступление — Пауза 6 сек]</w:t>
         <w:br/>
         <w:br/>
-        <w:t>Сделайте ровный, глубокий вдох, наполняя грудь так, словно вдыхаете чистый горный воздух. И долгий выдох. [Пауза 4 сек]</w:t>
+        <w:t>Закройте глаза. [Пауза 3 сек]</w:t>
         <w:br/>
-        <w:t>Позвольте каждому вдоху делать вас чуть больше, чуть объемнее, а каждому выдоху — уносить остатки чужих голосов, чужих ожиданий, чужих правил. [Пауза 5 сек]</w:t>
+        <w:t xml:space="preserve">Сделайте глубокий вдох… и с медленным, протяжным выдохом позвольте своему телу растечься по поверхности. </w:t>
         <w:br/>
-        <w:t>Сегодня вы возвращаете себе свое пространство. [Пауза 4 сек]</w:t>
+        <w:t>Сегодня мы не просто расслабляемся. Мы расширяем вашу архитектуру. Мы перестраиваем сами несущие конструкции вашей личности.</w:t>
+        <w:br/>
+        <w:t xml:space="preserve">С каждым вдохом вы вбираете в себя пространство, с каждым выдохом — ваше напряжение растворяется, уходит в землю пеплом. </w:t>
+        <w:br/>
+        <w:t>Почувствуйте, как тяжелеют ваши веки. Как опускаются плечи. Как живот становится мягким, позволяя дыханию опускаться в самый низ. [Пауза 5 сек]</w:t>
         <w:br/>
         <w:br/>
-        <w:t>Представьте, что вы стоите посреди прекрасного, залитого солнцем цветущего поместья. Это — ваша личная территория, ваше внутреннее королевство. [Пауза 5 сек]</w:t>
+        <w:t xml:space="preserve">Вообразите, что вы стоите на залитой средиземноморским солнцем земле. </w:t>
         <w:br/>
-        <w:t>Вокруг вас высокие, надежные белые каменные стены, увитые плющом и розами. Эти стены дышат теплом, они нагреты полуденным солнцем. Прикоснитесь к ним мысленно — почувствуйте шершавый, крепкий камень. Это граница вашей безопасности. Никто не может переступить ее без вашего позволения. Здесь царит мир, изобилие и глубокий, звенящий покой. [Пауза 6 сек]</w:t>
+        <w:t>Это ваше личное поместье. Ваша суверенная территория.</w:t>
+        <w:br/>
+        <w:t xml:space="preserve">Под вашими ногами — теплые, нагретые солнцем белые каменные плиты. Вокруг вас — густые сады. Воздух напоен терпким запахом кипарисов, прогретой пыли и цветущих лимонных деревьев. </w:t>
+        <w:br/>
+        <w:t>И самое главное — вокруг вашего поместья возвышаются мощные, неприступные, белоснежные каменные стены. Это границы вашего суверенитета. Они древние, крепкие, выдержавшие сотни осад. Никто не может войти сюда без вашего на то позволения. Здесь правите только вы. Здесь законы диктуете вы. [Пауза 6 сек]</w:t>
         <w:br/>
         <w:br/>
-        <w:t>Почувствуйте свои стопы на этой плодородной земле. И ощутите, как от самого копчика до макушки внутри вас выстраивается прямой, нерушимый золотой стержень. [Пауза 5 сек]</w:t>
+        <w:t xml:space="preserve">Чтобы удерживать это пространство, вам нужна правильная внутренняя опора. </w:t>
         <w:br/>
-        <w:t>Плотный, горячий монолит вашей воли. Ваша осанка меняется сама собой. Плечи расправляются, подбородок слегка приподнимается. Вы стоите здесь не как гость, и не как проситель. Вы стоите здесь как абсолютный суверен, как Хозяин или Хозяйка своей жизни. [Пауза 5 сек]</w:t>
+        <w:t xml:space="preserve">Перенесите внимание на свой позвоночник. Представьте, как у самого основания копчика зарождается капля расплавленного, сияющего золота. Она начинает медленно подниматься вверх. Позвонок за позвонком. Заполняя каждый сегмент вашего позвоночника колоссальной, царственной плотностью. </w:t>
         <w:br/>
-        <w:t>Почувствуйте тяжелое, приятное тепло в тазу и ногах — это ваша власть над своим выбором. [Пауза 5 сек]</w:t>
+        <w:t>Ваш позвоночник превращается в монолитную золотую ось. Тяжелую. Несгибаемую. Вы чувствуете, как эта ось выравнивает вашу осанку, поднимает подбородок. Это не напряжение. Это гравитация вашего достоинства. Вы стоите на своей земле, опираясь на свой собственный, нерушимый золотой стержень. [Пауза 5 сек]</w:t>
         <w:br/>
         <w:br/>
-        <w:t>И в этом состоянии суверена вы подходите к массивным, кованым дубовым вратам — единственному входу на вашу территорию. Рядом с вратами стоит ваш Внутренний Страж — мудрый, спокойный, огромной силы. Он смотрит на вас, ожидая ваших приказов. [Пауза 5 сек]</w:t>
+        <w:t xml:space="preserve">Вы идете по каменным плитам к главным воротам своего поместья. </w:t>
         <w:br/>
-        <w:t>Пора снять с себя старые обеты. Скажите себе прямо сейчас: «Я больше не спасатель. Я больше не подбираю раненых птиц, чтобы заслужить их любовь. Я больше не лечу чужие травмы своим теплом». [Пауза 6 сек]</w:t>
+        <w:t xml:space="preserve">Это массивные, тяжелые врата из кованого железа и векового дерева. </w:t>
         <w:br/>
-        <w:t>Почувствуйте, как с этими словами с ваших плеч падает невидимый рюкзак с камнями. [Пауза 4 сек]</w:t>
+        <w:t xml:space="preserve">Рядом с ними стоит ваш Внутренний Страж. Высокая, мощная фигура в темных, матовых доспехах. Он неподвижен, но его взгляд видит всех насквозь. Он служит только вам. Его единственная задача — не впускать на вашу землю тех, кто несет разрушение, хаос и боль. </w:t>
         <w:br/>
         <w:br/>
-        <w:t>Повернитесь к Стражу и провозгласите свой новый закон, свой Фильтр Достоинства: «С этого момента в мои врата входит только тот, кто приносит мир. Тот, кто приносит уважение. Тот, кто способен на взаимность и заботу. Все остальные — остаются за стеной». [Пауза 6 сек]</w:t>
+        <w:t xml:space="preserve">Долгое время эти ворота были распахнуты настежь. Вы впускали тех, кого нужно было спасать. Тех, кого нужно было чинить, лечить, обогревать своей кровью. Вы надевали на себя мокрые, холодные лохмотья "спасателя", надеясь, что в ответ на вашу жертву вам дадут немного тепла. </w:t>
         <w:br/>
-        <w:t>Услышьте, как со звонким, тяжелым щелчком закрывается старый замок на вратах. Теперь вы в абсолютной безопасности. [Пауза 5 сек]</w:t>
+        <w:t xml:space="preserve">Посмотрите на эти лохмотья прямо сейчас. Почувствуйте, как они тянут вас к земле, как они смердят чужой беспомощностью и вашим собственным истощением. </w:t>
+        <w:br/>
+        <w:t xml:space="preserve">Снимите их. Сбросьте их прямо на камни. </w:t>
+        <w:br/>
+        <w:t>Вам больше не нужно никого спасать, чтобы доказать, что вы существуете. Вам больше не нужно выслуживать право на любовь. [Пауза 6 сек]</w:t>
         <w:br/>
         <w:br/>
-        <w:t>И от этого осознания золотой монолит внутри вас начинает сиять еще ярче. Это сияние поднимается в грудную клетку, согревает сердце. [Пауза 5 сек]</w:t>
+        <w:t xml:space="preserve">Вы кладете руку на холодное железо врат. И произносите свой новый закон. Новый фильтр выбора. </w:t>
         <w:br/>
-        <w:t>Почувствуйте, как это мягкое, но мощное тепло поднимается выше, к горлу, и растворяет, расплавляет старый, жесткий ком недосказанности и страха. Ваше горло свободно. Ваш голос обретает силу и вес. [Пауза 6 сек]</w:t>
+        <w:t xml:space="preserve">«С этого момента на мою территорию заходят только те, кто равен мне по силе. </w:t>
+        <w:br/>
+        <w:t xml:space="preserve">Я больше не реабилитационный центр для чужих травм. </w:t>
+        <w:br/>
+        <w:t xml:space="preserve">Я больше не донор для эмоциональных инвалидов. </w:t>
+        <w:br/>
+        <w:t xml:space="preserve">Я выбираю только тех, с кем мне не нужно прятать свой свет, чтобы не ослепить их. </w:t>
+        <w:br/>
+        <w:t xml:space="preserve">С кем я могу быть в своей истинной, королевской плотности. </w:t>
+        <w:br/>
+        <w:t>Вход на мою территорию — это привилегия. И эту привилегию нужно заслужить делами, стабильностью и ясным, открытым намерением». [Пауза 6 сек]</w:t>
         <w:br/>
         <w:br/>
-        <w:t>Вы стоите в своем широком, цветущем саду. Дышите полной грудью. Положите ладонь на центр груди, почувствуйте биение своего сердца — спокойное, ровное, сильное. [Пауза 5 сек]</w:t>
+        <w:t>Ваш Страж кивает. Он услышал приказ. Отныне фильтр включен. Ни один манипулятор, ни один инфантильный искатель материнского или отцовского тепла больше не переступит этот порог. Врата закрываются. С тяжелым, лязгающим звуком, который отдается в самой вашей груди, отсекая прошлое. [Пауза 5 сек]</w:t>
         <w:br/>
-        <w:t>Вы на своей земле. Вы под защитой своего достоинства. Запомните это состояние царственного покоя. [Пауза 5 сек]</w:t>
         <w:br/>
-        <w:t>Сделайте глубокий вдох… и мягко возвращайтесь в реальность. Откройте глаза, зная, что фильтр уже работает. [Музыкальное завершение — Пауза 6 сек]</w:t>
+        <w:t xml:space="preserve">И как только врата закрываются, золотая ось в вашем позвоночнике вспыхивает ярче. </w:t>
+        <w:br/>
+        <w:t>Этот золотой свет разливается из позвоночника в ваше сердце. Он заполняет грудную клетку, выталкивая, вымывая старый спазм самообесценивания. Свет поднимается в горло, растворяя комки несказанных слов. Ваш голос отныне звучит из этой глубины — спокойно, ровно, без попыток кому-то угодить. Вы звучите, как сама Земля. [Пауза 5 сек]</w:t>
+        <w:br/>
+        <w:br/>
+        <w:t xml:space="preserve">Вы стоите посреди своего цветущего сада. </w:t>
+        <w:br/>
+        <w:t xml:space="preserve">Воздух свеж. Горизонт над стенами чист и открыт. </w:t>
+        <w:br/>
+        <w:t>Положите руку себе на грудь, в центр грудины. Почувствуйте там тепло своей собственной ладони. Почувствуйте, как бьется ваше сердце — ровно, защищенно, сильно. Вы у себя есть. И вы себя больше не предадите. [Пауза 5 сек]</w:t>
+        <w:br/>
+        <w:br/>
+        <w:t xml:space="preserve">Сделайте глубокий, наполняющий вдох. </w:t>
+        <w:br/>
+        <w:t xml:space="preserve">Потянитесь всем телом, чувствуя эту золотую ось внутри. </w:t>
+        <w:br/>
+        <w:t xml:space="preserve">Ощутите границы своего тела. </w:t>
+        <w:br/>
+        <w:t>И когда будете готовы шагнуть в мир в новом статусе — откройте глаза. [Музыкальное завершение — Пауза 6 сек]</w:t>
       </w:r>
     </w:p>
     <w:p>
@@ -255,7 +339,7 @@
           <w:color w:val="0E6E5D"/>
           <w:sz w:val="26"/>
         </w:rPr>
-        <w:t>🎧 1.3. АУДИОНАСТРОЙКА: «СПОКОЙСТВИЕ И ДОСТОИНСТВО ПЕРЕД СВИДАНИЕМ» (Бонус 2)</w:t>
+        <w:t>🎧 1.3. АУДИОНАСТРОЙКА: «СПОКОЙСТВИЕ И ДОСТОИНСТВО ПЕРЕД СВИДАНИЕМ» (Бонус 2, 528 Hz)</w:t>
       </w:r>
     </w:p>
     <w:p>
@@ -278,15 +362,15 @@
           <w:rFonts w:ascii="Calibri" w:hAnsi="Calibri"/>
           <w:sz w:val="19"/>
         </w:rPr>
-        <w:t>• Главная мишень: Снятие тревоги оценки («понравлюсь ли я?», синдром самозванца перед свиданием).</w:t>
+        <w:t>• Главная мишень: Снятие невротического тремора, синдрома самозванца и суеты перед свиданием.</w:t>
         <w:br/>
-        <w:t>• Соматический фокус: Расслабление мимических мышц лица, гортани и глубокое брюшное дыхание.</w:t>
+        <w:t>• Соматический фокус: Тяжелая бархатная мантия на плечах, расслабление лицевых мышц и челюсти, брюшное замедленное дыхание.</w:t>
         <w:br/>
-        <w:t>• Терапевтический результат: Общение из взрослой исследовательской позиции: «подходит ли мне этот человек?» вместо «понравлюсь ли я ему?» Общение на равных, без масок.</w:t>
+        <w:t>• Терапевтический результат: Общение из взрослой исследовательской позиции: «подходит ли он мне?» вместо заискивающего желания понравиться.</w:t>
         <w:br/>
-        <w:t>• Параметры начитки: Хронометраж 6–7 мин (~500 слов) | Музыка FlowMusic 528 Hz, До мажор</w:t>
+        <w:t>• Параметры начитки: Хронометраж 8–9 мин (~750 слов) | Музыка FlowMusic 528 Hz, До мажор</w:t>
         <w:br/>
-        <w:t>• Архитектура Косички: А1 (Теплая бархатная мантия) ➔ Б1 (Расслабление челюсти и глаз) ➔ В (Ядро: Позиция исследователя и снятие кастинга) ➔ Б2 (Уверенные ноги и походка) ➔ А2 (Ясный взгляд и полуулыбка)</w:t>
+        <w:t>• Архитектура Косички: А1 (Королевская бархатная мантия) ➔ Б1 (Снятие маски с лица и челюсти) ➔ В (Ядро: Позиция исследователя, врожденная ценность) ➔ Б2 (Гравитация в тазу и уверенные шаги) ➔ А2 (Ясный взгляд и полуулыбка силы)</w:t>
       </w:r>
     </w:p>
     <w:p>
@@ -301,40 +385,62 @@
         <w:t>[Музыкальное вступление — Пауза 4 сек]</w:t>
         <w:br/>
         <w:br/>
-        <w:t>Сделайте спокойный, мягкий вдох. Выдохните через полуоткрытые губы, как будто задуваете свечу… [Пауза 3 сек]</w:t>
+        <w:t>Сядьте прямо. Найдите опору под ногами. [Пауза 3 сек]</w:t>
         <w:br/>
-        <w:t>Прямо сейчас, позвольте суете, которая обычно предшествует встречам, просто остановиться. Никуда не нужно бежать. Вы уже готовы. Всё уже хорошо. [Пауза 4 сек]</w:t>
+        <w:t>Прямо сейчас, перед тем как выйти за дверь или подключиться к экрану, мы снимем с вас всю эту шелуху. Всю суету, весь тремор, всё это невротическое дребезжание, которое заставляет вас суетиться.</w:t>
+        <w:br/>
+        <w:t xml:space="preserve">Сделайте глубокий вдох животом. И медленный, ровный выдох через полуоткрытые губы, как будто вы выдыхаете через тонкую соломинку. </w:t>
+        <w:br/>
+        <w:t>И еще раз. Вдох, расширяя ребра… И выдох, длинный, гасящий любую скорость. [Пауза 4 сек]</w:t>
         <w:br/>
         <w:br/>
-        <w:t>Представьте, что на ваши плечи мягко ложится тяжелая, бархатная мантия. [Пауза 4 сек]</w:t>
+        <w:t xml:space="preserve">Представьте, что прямо сейчас на ваши плечи ложится тяжелая, королевская мантия. </w:t>
         <w:br/>
-        <w:t>Она сшита из густого, теплого света. Как только она касается ваших плеч, вся спешка, все сомнения мгновенно растворяются в ее тепле. Это мантия вашей ценности. Она укутывает вас, даря чувство абсолютной, безусловной защищенности. [Пауза 5 сек]</w:t>
+        <w:t xml:space="preserve">Она сшита из самого плотного, темного бархата, подбита теплым мехом. Почувствуйте ее физический вес на своих плечах. Эта тяжесть мгновенно осаживает вас. Она прижимает к земле вашу суету. </w:t>
+        <w:br/>
+        <w:t>Вам больше некуда спешить. Люди в мантиях не бегают. Они ступают медленно, тяжело, оставляя глубокие следы в пространстве. [Пауза 5 сек]</w:t>
         <w:br/>
         <w:br/>
-        <w:t>Под тяжестью этой мантии ваши плечи опускаются вниз. [Пауза 4 сек]</w:t>
+        <w:t xml:space="preserve">Пройдитесь вниманием по лицу. </w:t>
         <w:br/>
-        <w:t>Разожмите зубы. Позвольте нижней челюсти слегка отвиснуть. Расслабьте губы, снимите напряжение с круговых мышц глаз — пусть взгляд станет мягким, расфокусированным. [Пауза 4 сек]</w:t>
+        <w:t xml:space="preserve">Снимите маску «хорошей девочки» или «хорошего мальчика». Снимите маску «я всем нравлюсь». Расслабьте лоб. Разожмите челюсть. Уберите это напряженное ожидание из уголков глаз. Ваше лицо становится спокойным, расслабленным, слегка отстраненным. </w:t>
         <w:br/>
-        <w:t>Переведите дыхание вниз, в живот. Вдох — живот надувается, выдох — опадает. Мягко. Спокойно. Уверенно. [Пауза 5 сек]</w:t>
+        <w:t>Вам не нужно никого очаровывать. Вам не нужно сдавать экзамен. [Пауза 4 сек]</w:t>
         <w:br/>
         <w:br/>
-        <w:t>Слушайте мой голос и впитывайте эти слова, позволяя им стать вашей истиной. Вы идете не на экзамен. Вас не будут оценивать. [Пауза 4 сек]</w:t>
+        <w:t xml:space="preserve">Услышьте меня сейчас очень внимательно. </w:t>
         <w:br/>
-        <w:t>Это не кастинг, где нужно заслужить чье-то одобрение. Ваша ценность уже с вами — она врождённая, неизменная, как вес золота. [Пауза 5 сек]</w:t>
+        <w:t xml:space="preserve">Вы не идете на кастинг. Вы не товар на полке, который ждет, чтобы его выбрали, оценили и купили. </w:t>
         <w:br/>
-        <w:t>Вы идете на встречу с позиции исследователя. Единственный вопрос, который вас сегодня интересует: «Подходит ли этот человек МОЕМУ миру? Интересен ли он МНЕ? Безопасно ли мне рядом с ним?». [Пауза 6 сек]</w:t>
+        <w:t xml:space="preserve">Вы — главный акционер своей жизни. Вы — исследователь. </w:t>
         <w:br/>
-        <w:t>Вы не пытаетесь понравиться. Вы смотрите, слушаете и выбираете. Выбираете ВЫ. [Пауза 5 сек]</w:t>
+        <w:t xml:space="preserve">Это ВЫ идете смотреть. Это ВЫ идете изучать того человека, который сидит напротив. Подходит ли он для вашей вселенной? Выдержит ли он вашу плотность? Способен ли он говорить с вами на вашем языке? </w:t>
         <w:br/>
         <w:br/>
-        <w:t>Почувствуйте, как это осознание делает ваши ноги теплыми, плотными, устойчивыми. Как будто в ваших ботинках появились свинцовые стельки. [Пауза 5 сек]</w:t>
+        <w:t xml:space="preserve">Переключите тумблер в голове из позиции «Ой, а как я выгляжу, а понравлюсь ли я?» в позицию снайпера, исследователя, ученого. </w:t>
         <w:br/>
-        <w:t>Каждый ваш шаг сегодня будет неторопливым, уверенным, весомым. Вы идете из центра своей силы. [Пауза 4 сек]</w:t>
+        <w:t>«Кто ты? Что ты несешь в этот мир? Сможешь ли ты быть со мной рядом, не забирая мой свет?»</w:t>
+        <w:br/>
+        <w:t>Ваша ценность безусловна. Она врожденная. Ее не нужно подтверждать чужими взглядами, чужими комплиментами или лайками. Ваша ценность просто ЕСТЬ. Как факт. Как гравитация Земли. Никому в голову не приходит доказывать существование гравитации. Так же никому, и прежде всего вам, не нужно доказывать вашу ценность. [Пауза 5 сек]</w:t>
         <w:br/>
         <w:br/>
-        <w:t>Сохраняя тепло бархатной мантии на своих плечах, позвольте легкой, едва заметной полуулыбке коснуться ваших губ. Это улыбка человека, который знает свою цену. [Пауза 5 сек]</w:t>
+        <w:t xml:space="preserve">Почувствуйте эту массивную, теплую гравитацию в центре своего таза. В своем животе. </w:t>
         <w:br/>
-        <w:t>Ваш взгляд ясен, ваше дыхание ровно. Сделайте глубокий вдох, расправьте плечи и с выдохом открывайте глаза. Вы готовы. Идите и наслаждайтесь своим временем. [Музыкальное завершение — Пауза 5 сек]</w:t>
+        <w:t xml:space="preserve">Вы подобны большой, грациозной кошке, которая отдыхает на солнце. Она может быть расслабленной, но она в любой момент владеет ситуацией. </w:t>
+        <w:br/>
+        <w:br/>
+        <w:t xml:space="preserve">Сейчас вы встанете. И каждый ваш шаг будет тяжелым, уверенным, полным достоинства. </w:t>
+        <w:br/>
+        <w:t xml:space="preserve">Вы будете говорить чуть медленнее, чем обычно. </w:t>
+        <w:br/>
+        <w:t>Ваш взгляд будет ясным, прямым, с легкой полуулыбкой человека, который уже знает главную тайну: с вами ВСЁ ТАК. Вы в абсолютном порядке. [Пауза 4 сек]</w:t>
+        <w:br/>
+        <w:br/>
+        <w:t xml:space="preserve">Сделайте финальный, глубокий вдох. Наполните грудь этим знанием. </w:t>
+        <w:br/>
+        <w:t xml:space="preserve">Выдохните. Ощутите вес мантии на своих плечах. </w:t>
+        <w:br/>
+        <w:t>Откройте глаза. Вы готовы. Идите и возьмите своё. [Музыкальное завершение — Пауза 5 сек]</w:t>
       </w:r>
     </w:p>
     <w:sectPr>

</xml_diff>

<commit_message>
audio: reconfigure all 4 scenarios with completely unique non-repeating metaphor systems (S1: Clockmaker & Estate, S2: 100m Ocean & Hearth, S3: Taiga Hot Spring & Memory Hall Fire, S4: Mountain Shelter & Stone Bridge)
</commit_message>
<xml_diff>
--- a/baza/медитации_и_аудио/МЕДИТАЦИИ_СЦЕНАРИЙ_1_Я_ВЫБИРАЮ_МАГИГ.docx
+++ b/baza/медитации_и_аудио/МЕДИТАЦИИ_СЦЕНАРИЙ_1_Я_ВЫБИРАЮ_МАГИГ.docx
@@ -28,7 +28,9 @@
           <w:color w:val="555555"/>
           <w:sz w:val="22"/>
         </w:rPr>
-        <w:t>Монументальный свод 3-х полных трансовых сессий без сокращений (12–15 минут звучания)</w:t>
+        <w:t>Монументальный свод 3-х полных трансовых сессий по методу Анатолия Фёдорова (МАГиГ)</w:t>
+        <w:br/>
+        <w:t>Уникальный атлас метафор: Мастерская часовщика, Средиземноморское поместье и Бархатная мантия суверена</w:t>
         <w:br/>
         <w:t>Спикер: Федоров Анатолий Игоревич (Семейный психолог, гипнолог, проректор МАГиГ)</w:t>
       </w:r>
@@ -67,15 +69,15 @@
           <w:rFonts w:ascii="Calibri" w:hAnsi="Calibri"/>
           <w:sz w:val="19"/>
         </w:rPr>
-        <w:t>• Главная мишень: Снятие адреналиновой зависимости от «эмоциональных качелей» (горячо/холодно) и идеализации недоступных партнеров.</w:t>
+        <w:t>• Главная мишень: Снятие адреналиновой зависимости от эмоциональных качелей (горячо/холодно) и идеализации недоступных партнеров.</w:t>
         <w:br/>
-        <w:t>• Соматический фокус: Дыхание 3-2-6, ступенчатое расслабление от макушки до стоп, снятие спазма с челюсти, заземление корней в гранит.</w:t>
+        <w:t>• Соматический фокус: Дыхание 3-2-6, расслабление жевательных мышц, опускание плеч, ощущение тяжести в кресле у камина, остановка маятника тревоги.</w:t>
         <w:br/>
-        <w:t>• Терапевтический результат: Разрыв связки «тревога = страсть». Остановка внутреннего маятника тревоги. Возврат жизненной энергии в тело.</w:t>
+        <w:t>• Терапевтический результат: Разрыв связки «тревога = страсть». Остановка внутреннего метронома спешки. Возврат энергии из фантазий в тело.</w:t>
         <w:br/>
-        <w:t>• Параметры начитки: Хронометраж 12–14 мин (~1050 слов) | Музыка FlowMusic 432 Hz, Ре минор | Дыхательный ритм 3-2-6</w:t>
+        <w:t>• Параметры начитки: Хронометраж 12–14 мин (~1050 слов) | Музыка FlowMusic 432 Hz, Ре минор | Ритм 3-2-6</w:t>
         <w:br/>
-        <w:t>• Архитектура Косички: А1 (Мастерская часовщика в дождь) ➔ Б1 (Корни в гранитном щите) ➔ В (Ядро: Океан 50м, остановка бронзового маятника) ➔ Б2 (Янтарная сила земли) ➔ А2 (Возврат к чаю и пульсу часов)</w:t>
+        <w:t>• Архитектура Косички: А1 (Старая мастерская часовщика в дождь) ➔ Б1 (Глубокое кожаное кресло и тепло очага) ➔ В (Ядро: Остановка гигантского бронзового маятника спешки в нулевой точке) ➔ Б2 (Тяжелое янтарное тепло наполняет позвоночник) ➔ А2 (Ровный пульс старых часов и горячий чай)</w:t>
       </w:r>
     </w:p>
     <w:p>
@@ -87,106 +89,119 @@
           <w:rFonts w:ascii="Calibri" w:hAnsi="Calibri"/>
           <w:sz w:val="21"/>
         </w:rPr>
-        <w:t>[Музыкальное вступление — Пауза 6 сек]</w:t>
+        <w:t>[Музыкальное вступление: бархатный глубокий фон 432 Гц — Пауза 6 сек]</w:t>
         <w:br/>
         <w:br/>
-        <w:t>Устраивайтесь максимально удобно. [Пауза 3 сек]</w:t>
+        <w:t>Устраивайся максимально удобно. [Пауза 3 сек]</w:t>
         <w:br/>
-        <w:t>Так, чтобы ваше тело могло полностью сдаться гравитации. Почувствуйте опору под собой. Это не просто кресло или кровать — это фундамент, который держит вас абсолютно надежно. Вам больше не нужно держать себя. Отдайте свой вес этой опоре. [Пауза 4 сек]</w:t>
+        <w:t>Так, чтобы твое тело могло полностью сдаться опоре. Почувствуй кресло или кровать под собой. Это не просто мебель — это фундамент, который держит тебя абсолютно надежно. Тебе больше не нужно напрягаться и держать себя. Отдай свой вес этой опоре. [Пауза 4 сек]</w:t>
         <w:br/>
         <w:br/>
-        <w:t>Сделайте глубокий, медленный вдох… И протяжный, тяжелый выдох.</w:t>
+        <w:t>Сделай глубокий, медленный вдох носом... и протяжный, тяжелый выдох. [Пауза 4 сек]</w:t>
         <w:br/>
-        <w:t>Сейчас мы настроим ваш внутренний ритм. Дыхание по схеме три-два-шесть.</w:t>
+        <w:t xml:space="preserve">Сейчас мы настроим твой внутренний ритм. Дыхание три-два-шесть. </w:t>
         <w:br/>
-        <w:t>Вдох на три счета: один… два… три.</w:t>
+        <w:t xml:space="preserve">Вдох на три счета: раз... два... три. </w:t>
         <w:br/>
-        <w:t>Задержка: один… два.</w:t>
+        <w:t xml:space="preserve">Задержка: раз... два. </w:t>
         <w:br/>
-        <w:t>И длинный, освобождающий выдох, как тяжелый вздох, на шесть: один… два… три… четыре… пять… шесть.</w:t>
+        <w:t>И длинный, освобождающий выдох на шесть: раз... два... три... четыре... пять... шесть. [Пауза 5 сек]</w:t>
         <w:br/>
-        <w:t xml:space="preserve">Еще раз. Вдох: один, два, три. </w:t>
+        <w:t xml:space="preserve">Еще раз. Вдох: раз, два, три. </w:t>
         <w:br/>
-        <w:t>Держим: один, два.</w:t>
+        <w:t xml:space="preserve">Пауза: раз, два. </w:t>
         <w:br/>
-        <w:t>Выдох: густой, медленный, отпускающий контроль… до самого конца. [Пауза 5 сек]</w:t>
+        <w:t>И выдох: густой, медленный, отпускающий контроль... до самого конца. [Пауза 5 сек]</w:t>
         <w:br/>
         <w:br/>
-        <w:t>С каждым таким выдохом плотная, теплая волна расслабления начинает свой путь от самой макушки. [Пауза 3 сек]</w:t>
+        <w:t>С каждым выдохом теплая волна расслабления начинает свой путь от самой макушки. [Пауза 3 сек]</w:t>
         <w:br/>
-        <w:t xml:space="preserve">Почувствуйте, как расслабляется кожа головы. Как тяжелеет лоб. Разглаживаются микроспазмы вокруг глаз. Ваши веки становятся тяжелыми, словно налитыми свинцом. Их просто не хочется открывать. </w:t>
+        <w:t xml:space="preserve">Расслабляется кожа головы. Тяжелеет лоб. Разглаживаются микроспазмы вокруг глаз. Твои веки становятся тяжелыми. Их просто не хочется открывать. </w:t>
         <w:br/>
-        <w:t>Волна спускается ниже. Расслабляются скулы. Разожмите челюсти. Позвольте нижней челюсти слегка отвиснуть. Именно здесь, в этих жевательных мышцах, вы годами носили сдержанные слова, подавленный гнев и невыплаканную боль. Отпустите их. [Пауза 4 сек]</w:t>
+        <w:t>Волна спускается ниже. Расслабляются скулы. Разожми челюсти. Позволь нижней челюсти слегка отвиснуть. Именно здесь, в этих жевательных мышцах, годами копились сдержанные слова, тревожные паузы и сомнения. Отпусти их. [Пауза 5 сек]</w:t>
         <w:br/>
-        <w:t>Тяжелое, густое тепло стекает по шее, ложится на плечи массивным, теплым пледом. Плечи опускаются на миллиметр… еще на миллиметр вниз. Волна течет по рукам, предплечьям, к самым кончикам пальцев. Ваши кисти тяжелеют, наполняясь спокойным пульсом крови. Груды камней спадают с вашей грудной клетки. Живот становится мягким, расслабленным, живым. Тепло спускается по бедрам, икрам, прямо в стопы. Ваше тело становится тяжелым, теплым, неподвижным монолитом. [Пауза 5 сек]</w:t>
+        <w:t>Тепло ложится на плечи мягким, тяжелым пледом. Плечи опускаются на сантиметр вниз. Волна течет по рукам к самым кончикам пальцев. Кисти тяжелеют, наполняясь спокойным пульсом крови. Грудь дышит свободно. Живот мягкий и живой. Тело становится тяжелым, теплым, неподвижным монолитом. [Пауза 6 сек]</w:t>
         <w:br/>
         <w:br/>
-        <w:t xml:space="preserve">И сейчас, сквозь эту плотную тяжесть расслабления, вы переноситесь в другое пространство. </w:t>
+        <w:t>[Нитка А1: Мастерская часовщика]</w:t>
         <w:br/>
-        <w:t xml:space="preserve">Вы стоите на пороге старой мастерской часовщика. За окном хлещет плотный осенний дождь. Вы слышите, как тяжелые капли барабанят по свинцовым переплетам витражных стекол. Но здесь, внутри, царит абсолютная, защищенная тишина. </w:t>
+        <w:t xml:space="preserve">И сквозь эту плотную тяжесть расслабления ты переносишься в особое пространство. </w:t>
         <w:br/>
-        <w:t xml:space="preserve">Вы делаете шаг внутрь. Воздух здесь густой. Он пахнет старым, просушенным веками дубом. Пахнет пчелиным воском, растопленной канифолью и тонким ароматом часового масла. </w:t>
+        <w:t xml:space="preserve">Ты стоишь на пороге старой мастерской часовщика на тихой европейской улочке. За окном хлещет плотный осенний дождь. Слышно, как тяжелые капли барабанят по стеклам. Но здесь, внутри — абсолютная, защищенная тишина. </w:t>
         <w:br/>
-        <w:t>Вокруг вас — десятки старинных часов. Настенные, напольные, каминные. Они не создают суеты. Наоборот, их мерное, глубокое тиканье создает симфонию абсолютной стабильности. Век за веком, секунда за секундой. Медные маятники плавно, предсказуемо качаются из стороны в сторону. Здесь нет спешки. Время здесь принадлежит только вам. Оно течет густо, как золотой мед с деревянной ложки. Вы садитесь в массивное кожаное кресло у камина, в котором мерно потрескивают дубовые поленья. [Пауза 6 сек]</w:t>
+        <w:t xml:space="preserve">Ты делаешь шаг внутрь. Воздух густой, пахнет старым просушенным дубом, пчелиным воском и часовым маслом. </w:t>
+        <w:br/>
+        <w:t>Вокруг тебя — десятки старинных механических часов. Настенные, напольные, каминные. Они не создают суеты. Их мерное, глубокое тиканье создает симфонию стабильности. Век за веком, секунда за секундой. Медные маятники плавно качаются из стороны в сторону. Время здесь принадлежит только тебе. Оно течет густо, как янтарный мед. Ты садишься в массивное кожаное кресло у камина, в котором мерно потрескивают дубовые поленья. [Пауза 7 сек]</w:t>
         <w:br/>
         <w:br/>
-        <w:t xml:space="preserve">Сидя в этом кресле, переведите внимание на свои стопы. </w:t>
+        <w:t>[Нитка Б1: Соматическая опора кресла и камина]</w:t>
         <w:br/>
-        <w:t xml:space="preserve">Почувствуйте, как от подошв ваших ног начинают прорастать толстые, мощные энергетические корни. Они легко пробивают старые дубовые доски пола. Уходят в сырую, темную, плодородную землю. Глубже. Сквозь слои глины, песка, сквозь холодные подземные реки. Ваши корни устремляются в самые недра планеты, пока не достигают колоссального гранитного щита. </w:t>
+        <w:t xml:space="preserve">Сидя в этом кресле, почувствуй, как его спинка и подлокотники забирают всю накопившуюся усталость. </w:t>
         <w:br/>
-        <w:t>Почувствуйте этот момент касания. Древняя вековая скала. Неподвижная. Огромная. Ваши корни намертво вплетаются в этот гранит. Вы прикованы к центру земного притяжения. Что бы ни происходило на поверхности — ураганы, штормы, кризисы — вы здесь, внизу, абсолютно неподвижны. Вас держит масса всей планеты. Вы — гора, которую невозможно сдвинуть. [Пауза 6 сек]</w:t>
+        <w:t xml:space="preserve">Тысячи людей куда-то бегут, суетятся, спешат понравиться, ждут звонков... А здесь время остановилось. </w:t>
+        <w:br/>
+        <w:t xml:space="preserve">Твои стопы плотно стоят на массивных деревянных досках пола. </w:t>
+        <w:br/>
+        <w:t xml:space="preserve">Тепло от камина согревает колени, ладони, лицо. </w:t>
+        <w:br/>
+        <w:t>Внутри тебя наступает тишина, в которой нет места суете. [Пауза 6 сек]</w:t>
         <w:br/>
         <w:br/>
-        <w:t xml:space="preserve">И из этой точки абсолютной устойчивости мы идем еще глубже. </w:t>
+        <w:t>[Нитка В: Ядро транса — Остановка маятника эмоциональных качелей]</w:t>
         <w:br/>
-        <w:t xml:space="preserve">Представьте, что вы медленно погружаетесь в толщу океана. Десять метров… двадцать… свет с поверхности тускнеет. Тридцать метров. Вокруг только густой, сапфировый полумрак. Пятьдесят метров. </w:t>
+        <w:t xml:space="preserve">И в этой тишине посмотри в центр комнаты. Там возвышается огромный, старинный бронзовый маятник. </w:t>
         <w:br/>
-        <w:t>Здесь, на глубине пятидесяти метров, нет волн. Нет штормов. Давление воды обнимает вас, как тяжелое защитное одеяло. Вы опускаетесь на дно, как гигантский чугунный якорь. Тот самый якорь, который держит огромный лайнер во время любого, даже самого разрушительного урагана. Вы — этот якорь. Вы тяжелы, безмолвны и абсолютно спокойны. [Пауза 5 сек]</w:t>
+        <w:t xml:space="preserve">Это маятник твоих эмоциональных качелей. Он раскачивался годами: от эйфории к отчаянию, от иллюзий к холодной пустоте, от вспышки страсти к паническому ожиданию сообщения. </w:t>
+        <w:br/>
+        <w:t xml:space="preserve">Посмотри на него внимательно. Тебе казалось, что эта болтанка, этот адреналиновый надрыв — это и есть любовь. </w:t>
+        <w:br/>
+        <w:t>Но прямо сейчас, из этой тишины, осознай: это не любовь. Это просто спазм выживания. Это адреналиновая ломка нервной системы, которую ты принимала за страсть. Любовь не пахнет паникой. Любовь пахнет теплом, покоем и надежностью. [Пауза 6 сек]</w:t>
         <w:br/>
         <w:br/>
-        <w:t xml:space="preserve">Здесь, в этой тишине, давайте посмотрим на то, что происходило с вами там, наверху. </w:t>
+        <w:t xml:space="preserve">Ты встаешь из кресла. Твои шаги тверды и спокойны. </w:t>
         <w:br/>
-        <w:t xml:space="preserve">Эмоциональные качели. Адреналиновая зависимость. Вам казалось, что эта боль, этот надрыв, эти резкие взлеты и падения — это и есть любовь. </w:t>
+        <w:t xml:space="preserve">Ты подходишь к этому огромному бронзовому маятнику. </w:t>
         <w:br/>
-        <w:t xml:space="preserve">Но посмотрите на это из глубины. Это не любовь. Это биологический шторм. Это спазм выживания. Это паника маленького, испуганного ребенка, который кричит в пустоту, умоляя, чтобы его заметили. Каждый раз, когда вас бросали в холод, а потом обдавали крохами тепла, ваша нервная система сжималась в судорогой. Вы спутали химию стресса, выброс кортизола и адреналина — с близостью. </w:t>
+        <w:t xml:space="preserve">Ты вытягиваешь руки вперед и спокойно кладешь ладони на его тяжелый металл. </w:t>
         <w:br/>
-        <w:t>Но любовь — это не спазм. Любовь не пахнет паникой. Любовь — это тихая, тяжелая, теплая гавань. [Пауза 5 сек]</w:t>
+        <w:t>И своей волей, своей взрослой силой ты останавливаешь его движение. [Пауза 4 сек]</w:t>
         <w:br/>
+        <w:t xml:space="preserve">Маятник замедляется... Амплитуда гаснет... </w:t>
         <w:br/>
-        <w:t xml:space="preserve">И сейчас, в этом безмолвном океане, вы видите перед собой гигантский бронзовый маятник. Это маятник ваших эмоциональных качелей. Он раскачивался годами. От эйфории к отчаянию. От надежды к мертвенной пустоте. Посмотрите на него. Его металл потемнел от ваших слез, он покрыт ржавчиной вашего истощения. </w:t>
-        <w:br/>
-        <w:t>Вы больше не обязаны обслуживать этот механизм.</w:t>
-        <w:br/>
-        <w:t>Вы подходите к этому маятнику. Ваши ноги прочно вросли в гранит. В вас — сила континентальных плит. Вы вытягиваете руки вперед… и кладете ладони на этот тяжелый, ледяной металл.</w:t>
-        <w:br/>
-        <w:t>И своей волей, своей монолитной тяжестью — вы останавливаете его. [Пауза 4 сек]</w:t>
-        <w:br/>
-        <w:t xml:space="preserve">Маятник замедляется. Остановка. </w:t>
+        <w:t xml:space="preserve">Остановка. </w:t>
         <w:br/>
         <w:t xml:space="preserve">Абсолютный центр. Нулевая точка. </w:t>
         <w:br/>
-        <w:t>Почувствуйте, как в этой точке тишины прекращается утечка вашей энергии. Больше ни капли вашей крови, ни одного джоуля вашей жизненной силы не уйдет на обслуживание чужих травм и больных сценариев. Качели остановлены. Механизм замер. Вы забираете свою энергию себе. [Пауза 6 сек]</w:t>
+        <w:t>Качели остановлены навсегда. Механизм тревожной спешки отключен. Вся твоя энергия, которую ты тратила на обслуживание чужих качелей, мгновенно возвращается в твое тело. [Пауза 7 сек]</w:t>
         <w:br/>
         <w:br/>
-        <w:t xml:space="preserve">Из того самого гранитного щита, в который вросли ваши корни, начинает подниматься густая, горячая, янтарная энергия земли. </w:t>
+        <w:t>[Закрытие Б2: Янтарное тепло в теле]</w:t>
         <w:br/>
-        <w:t>Она поднимается по корням, как магма. Входит в ваши стопы. Заполняет лодыжки, икры, колени. Густое, золотое тепло поднимается в таз, наливая его тяжелой первобытной силой. Эта энергия течет вверх по вашему позвоночнику. Позвонок за позвонком. Она выжигает остатки тревоги, растворяет ледяные узлы страха в солнечном сплетении. Она расправляет вашу грудную клетку изнутри. Ваши плечи сами собой расправляются. Вы чувствуете себя колоссом, наполненным первозданной, неисчерпаемой мощью. Ваше тело вибрирует спокойной, уверенной силой. [Пауза 5 сек]</w:t>
+        <w:t xml:space="preserve">Почувствуй, как плотная, теплая янтарная сила наполняет твои стопы. </w:t>
+        <w:br/>
+        <w:t xml:space="preserve">Она поднимается по ногам, наполняет таз, течет вверх вдоль позвоночника. Позвонок за позвонком. </w:t>
+        <w:br/>
+        <w:t>Она выжигает остатки сомнений, растворяет тревожный ком в груди. Твои плечи расправляются сами собой. Твоя осанка становится прямой и царственной. Ты наполнена спокойной, непоколебимой силой хозяйки своей жизни. [Пауза 6 сек]</w:t>
         <w:br/>
         <w:br/>
-        <w:t xml:space="preserve">Вы снова ощущаете себя в старой мастерской. В кожаном кресле. </w:t>
+        <w:t>[Закрытие А2: Возврат в кресло у очага]</w:t>
         <w:br/>
-        <w:t>В ваших руках — тяжелая керамическая кружка с горячим чаем. Вы чувствуете её тепло своими ладонями. За окном всё так же шумит дождь, смывая остатки старого, отжившего. А здесь, внутри, мерно, ритмично бьется пульс старых часов. Тик-так. Спокойно. Уверенно. Как ваше новое, сильное сердце. Как ваше новое право быть собой. [Пауза 5 сек]</w:t>
+        <w:t xml:space="preserve">Ты возвращаешься в свое кожаное кресло. В твоих руках — глиняная кружка со свежезаваренным чаем. </w:t>
+        <w:br/>
+        <w:t xml:space="preserve">Ты чувствуешь ее шершавое тепло ладонями. За окном шумит дождь, смывая прошлое. </w:t>
+        <w:br/>
+        <w:t>А в мастерской мерно, спокойно тикают часы. Тик-так... Это пульс твоего нового спокойствия. [Пауза 5 сек]</w:t>
         <w:br/>
         <w:br/>
-        <w:t>Сохраняя эту гранитную тяжесть, эту янтарную силу внутри себя, вы можете начать медленно возвращаться.</w:t>
+        <w:t>[Выход]</w:t>
         <w:br/>
-        <w:t xml:space="preserve">Пошевелите кончиками пальцев рук и ног. </w:t>
+        <w:t xml:space="preserve">Сделай глубокий, наполняющий вдох... И медленный выдох. </w:t>
         <w:br/>
-        <w:t xml:space="preserve">Сделайте глубокий, вкусный вдох, наполняя легкие новым воздухом. </w:t>
+        <w:t xml:space="preserve">Пошевели пальцами рук и ног. Потянись всем телом, ощущая свою плотность и уверенность. </w:t>
         <w:br/>
-        <w:t xml:space="preserve">И когда будете готовы — медленно откройте глаза. </w:t>
+        <w:t xml:space="preserve">И когда будешь готова — открывай глаза. </w:t>
         <w:br/>
-        <w:t>Вы здесь. Вы в безопасности. Вы в своей силе. [Музыкальное завершение — Пауза 6 сек]</w:t>
+        <w:t>Ты в безопасности. Ты в своей силе. Маятник остановлен. [Музыкальное завершение — Пауза 6 сек]</w:t>
       </w:r>
     </w:p>
     <w:p>
@@ -200,7 +215,7 @@
           <w:color w:val="0E6E5D"/>
           <w:sz w:val="26"/>
         </w:rPr>
-        <w:t>🎧 1.2. МЕДИТАЦИЯ: «НА СВОЕЙ ЗЕМЛЕ: НОВЫЙ ФИЛЬТР ВЫБОРА» (Урок 5, 963 Hz)</w:t>
+        <w:t>🎧 1.2. МЕДИТАЦИЯ: «НА СВОЕЙ ЗЕМЛЕ: СРЕДИЗЕМНОМОРСКОЕ ПОМЕСТЬЕ И ВРАТА ВЫБОРА» (Урок 5, 963 Hz)</w:t>
       </w:r>
     </w:p>
     <w:p>
@@ -223,15 +238,15 @@
           <w:rFonts w:ascii="Calibri" w:hAnsi="Calibri"/>
           <w:sz w:val="19"/>
         </w:rPr>
-        <w:t>• Главная мишень: Ликвидация спасательства, отказ от роли эмоционального донора, обретение царственного суверенитета.</w:t>
+        <w:t>• Главная мишень: Ликвидация спасательства, отказ от роли эмоционального донора, обретение суверенного фильтра выбора.</w:t>
         <w:br/>
-        <w:t>• Соматический фокус: Золотая монолитная ось вдоль позвоночника, расправление плеч, растворение кома в горле, тяжесть в тазу.</w:t>
+        <w:t>• Соматический фокус: Золотая титановая ось в позвоночнике, расправление грудной клетки, ощущение нагретых солнцем каменных плит под ногами.</w:t>
         <w:br/>
-        <w:t>• Терапевтический результат: Формирование непроницаемых личных границ и нового фильтра выбора: вход на территорию только для равных.</w:t>
+        <w:t>• Терапевтический результат: Формирование непроницаемых границ: «Я больше не спасаю, чтобы заслужить любовь. Вход на мою землю — только для равных».</w:t>
         <w:br/>
         <w:t>• Параметры начитки: Хронометраж 12–14 мин (~1100 слов) | Музыка FlowMusic 963 Hz, Соль мажор</w:t>
         <w:br/>
-        <w:t>• Архитектура Косички: А1 (Личное поместье за белыми стенами) ➔ Б1 (Золотая монолитная ось) ➔ В (Ядро: Врата, Страж, отказ от роли спасателя) ➔ Б2 (Золотой свет в сердце и горле) ➔ А2 (Цветущий сад и открытый горизонт)</w:t>
+        <w:t>• Архитектура Косички: А1 (Средиземноморское поместье за белыми стенами) ➔ Б1 (Золотая монолитная ось вдоль позвоночника) ➔ В (Ядро: Врата поместья, Внутренний Страж, сброс лохмотьев спасателя, провозглашение закона фильтра) ➔ Б2 (Золотое сияние в сердце и горле) ➔ А2 (Цветущий сад лимонов и открытый горизонт)</w:t>
       </w:r>
     </w:p>
     <w:p>
@@ -243,89 +258,103 @@
           <w:rFonts w:ascii="Calibri" w:hAnsi="Calibri"/>
           <w:sz w:val="21"/>
         </w:rPr>
-        <w:t>[Музыкальное вступление — Пауза 6 сек]</w:t>
+        <w:t>[Музыкальное вступление: светлый, звонкий фон 963 Гц — Пауза 6 сек]</w:t>
         <w:br/>
         <w:br/>
-        <w:t>Закройте глаза. [Пауза 3 сек]</w:t>
+        <w:t>Закрой глаза. [Пауза 3 сек]</w:t>
         <w:br/>
-        <w:t xml:space="preserve">Сделайте глубокий вдох… и с медленным, протяжным выдохом позвольте своему телу растечься по поверхности. </w:t>
+        <w:t xml:space="preserve">Сделай глубокий, свободный вдох... и с протяжным выдохом позволь себе полностью расслабиться. </w:t>
         <w:br/>
-        <w:t>Сегодня мы не просто расслабляемся. Мы расширяем вашу архитектуру. Мы перестраиваем сами несущие конструкции вашей личности.</w:t>
+        <w:t xml:space="preserve">Сегодня мы выстраиваем фундаментальную архитектуру твоего достоинства. </w:t>
         <w:br/>
-        <w:t xml:space="preserve">С каждым вдохом вы вбираете в себя пространство, с каждым выдохом — ваше напряжение растворяется, уходит в землю пеплом. </w:t>
-        <w:br/>
-        <w:t>Почувствуйте, как тяжелеют ваши веки. Как опускаются плечи. Как живот становится мягким, позволяя дыханию опускаться в самый низ. [Пауза 5 сек]</w:t>
+        <w:t>С каждым вдохом ты расширяешь свое внутреннее пространство, с каждым выдохом — отпускаешь чужие ожидания и старый страх быть отвергнутой. [Пауза 5 сек]</w:t>
         <w:br/>
         <w:br/>
-        <w:t xml:space="preserve">Вообразите, что вы стоите на залитой средиземноморским солнцем земле. </w:t>
+        <w:t>[Нитка А1: Средиземноморское поместье]</w:t>
         <w:br/>
-        <w:t>Это ваше личное поместье. Ваша суверенная территория.</w:t>
+        <w:t xml:space="preserve">Представь, что ты стоишь на залитой полуденным солнцем земле. </w:t>
         <w:br/>
-        <w:t xml:space="preserve">Под вашими ногами — теплые, нагретые солнцем белые каменные плиты. Вокруг вас — густые сады. Воздух напоен терпким запахом кипарисов, прогретой пыли и цветущих лимонных деревьев. </w:t>
+        <w:t xml:space="preserve">Это твое личное поместье. Твоя суверенная территория. </w:t>
         <w:br/>
-        <w:t>И самое главное — вокруг вашего поместья возвышаются мощные, неприступные, белоснежные каменные стены. Это границы вашего суверенитета. Они древние, крепкие, выдержавшие сотни осад. Никто не может войти сюда без вашего на то позволения. Здесь правите только вы. Здесь законы диктуете вы. [Пауза 6 сек]</w:t>
+        <w:t xml:space="preserve">Под твоими ногами — теплые, нагретые солнцем белые каменные плиты из древнего известняка. Вокруг тебя — цветущие сады, в воздухе стоит густой аромат кипарисов, диких роз и спелых лимонов. </w:t>
+        <w:br/>
+        <w:t>И главное — вокруг твоего поместья возвышаются мощные, неприступные белые каменные стены. Они сложены на века. Никто не может переступить эту границу без твоего согласия. Здесь правишь только ты. Здесь действуют только твои законы. [Пауза 7 сек]</w:t>
         <w:br/>
         <w:br/>
-        <w:t xml:space="preserve">Чтобы удерживать это пространство, вам нужна правильная внутренняя опора. </w:t>
+        <w:t>[Нитка Б1: Золотая ось достоинства]</w:t>
         <w:br/>
-        <w:t xml:space="preserve">Перенесите внимание на свой позвоночник. Представьте, как у самого основания копчика зарождается капля расплавленного, сияющего золота. Она начинает медленно подниматься вверх. Позвонок за позвонком. Заполняя каждый сегмент вашего позвоночника колоссальной, царственной плотностью. </w:t>
+        <w:t xml:space="preserve">Чтобы удерживать такое пространство, нужна безупречная внутренняя вертикаль. </w:t>
         <w:br/>
-        <w:t>Ваш позвоночник превращается в монолитную золотую ось. Тяжелую. Несгибаемую. Вы чувствуете, как эта ось выравнивает вашу осанку, поднимает подбородок. Это не напряжение. Это гравитация вашего достоинства. Вы стоите на своей земле, опираясь на свой собственный, нерушимый золотой стержень. [Пауза 5 сек]</w:t>
+        <w:t xml:space="preserve">Перенеси внимание на свой позвоночник. </w:t>
+        <w:br/>
+        <w:t xml:space="preserve">Представь, как у самого основания копчика рождается капля расплавленного, сияющего золота. </w:t>
+        <w:br/>
+        <w:t xml:space="preserve">Она начинает медленно подниматься вверх. Позвонок за позвонком. Заполняя каждый сегмент позвоночника нерушимой плотностью. </w:t>
+        <w:br/>
+        <w:t xml:space="preserve">Твой позвоночник превращается в монолитную золотую ось. </w:t>
+        <w:br/>
+        <w:t>Твоя осанка выравнивается сама собой. Плечи расправляются, подбородок слегка приподнимается. Это не напряжение — это гравитация твоего царственного достоинства. Ты стоишь на своей земле, опираясь на свой нерушимый стержень. [Пауза 6 сек]</w:t>
         <w:br/>
         <w:br/>
-        <w:t xml:space="preserve">Вы идете по каменным плитам к главным воротам своего поместья. </w:t>
+        <w:t>[Нитка В: Ядро транса — Врата поместья и Внутренний Страж]</w:t>
         <w:br/>
-        <w:t xml:space="preserve">Это массивные, тяжелые врата из кованого железа и векового дерева. </w:t>
+        <w:t xml:space="preserve">Ты неспешно идешь по каменным плитам к главным воротам своего поместья. </w:t>
         <w:br/>
-        <w:t xml:space="preserve">Рядом с ними стоит ваш Внутренний Страж. Высокая, мощная фигура в темных, матовых доспехах. Он неподвижен, но его взгляд видит всех насквозь. Он служит только вам. Его единственная задача — не впускать на вашу землю тех, кто несет разрушение, хаос и боль. </w:t>
+        <w:t xml:space="preserve">Это массивные дубовые врата с коваными железными засовами. </w:t>
+        <w:br/>
+        <w:t xml:space="preserve">Рядом с ними стоит твой Внутренний Страж — высокая, спокойная, мудрая фигура огромной силы. Он служит только тебе. Его задача — защищать чистоту твоей земли. </w:t>
         <w:br/>
         <w:br/>
-        <w:t xml:space="preserve">Долгое время эти ворота были распахнуты настежь. Вы впускали тех, кого нужно было спасать. Тех, кого нужно было чинить, лечить, обогревать своей кровью. Вы надевали на себя мокрые, холодные лохмотья "спасателя", надеясь, что в ответ на вашу жертву вам дадут немного тепла. </w:t>
+        <w:t xml:space="preserve">Вспомни: долгое время эти ворота были распахнуты настежь. </w:t>
         <w:br/>
-        <w:t xml:space="preserve">Посмотрите на эти лохмотья прямо сейчас. Почувствуйте, как они тянут вас к земле, как они смердят чужой беспомощностью и вашим собственным истощением. </w:t>
+        <w:t xml:space="preserve">Ты впускала тех, кого нужно было спасать, лечить, обогревать своей жизненной силой. Ты надевала на себя мокрые лохмотья «спасателя», надеясь, что за твою жертвенность тебя полюбят и оценят. </w:t>
         <w:br/>
-        <w:t xml:space="preserve">Снимите их. Сбросьте их прямо на камни. </w:t>
+        <w:t xml:space="preserve">Посмотри на эти лохмотья прямо сейчас. Почувствуй, как они тянут тебя вниз, как они пахнут чужой беспомощностью и твоим истощением. </w:t>
         <w:br/>
-        <w:t>Вам больше не нужно никого спасать, чтобы доказать, что вы существуете. Вам больше не нужно выслуживать право на любовь. [Пауза 6 сек]</w:t>
+        <w:t xml:space="preserve">Сними их. Сбрось их прямо на камни. </w:t>
+        <w:br/>
+        <w:t>Тебе больше не нужно никого спасать, чтобы доказать свою ценность. Твоя ценность абсолютна по праву рождения. [Пауза 6 сек]</w:t>
         <w:br/>
         <w:br/>
-        <w:t xml:space="preserve">Вы кладете руку на холодное железо врат. И произносите свой новый закон. Новый фильтр выбора. </w:t>
+        <w:t xml:space="preserve">Положи руку на кованый засов врат и громко, твердо провозгласи свой Новый Закон Выбора: </w:t>
         <w:br/>
-        <w:t xml:space="preserve">«С этого момента на мою территорию заходят только те, кто равен мне по силе. </w:t>
+        <w:t xml:space="preserve">«С этого момента на мою территорию заходят только те, кто равен мне по силе и зрелости. </w:t>
         <w:br/>
         <w:t xml:space="preserve">Я больше не реабилитационный центр для чужих травм. </w:t>
         <w:br/>
-        <w:t xml:space="preserve">Я больше не донор для эмоциональных инвалидов. </w:t>
+        <w:t xml:space="preserve">Я больше не донор для эмоциональной пустоты. </w:t>
         <w:br/>
-        <w:t xml:space="preserve">Я выбираю только тех, с кем мне не нужно прятать свой свет, чтобы не ослепить их. </w:t>
-        <w:br/>
-        <w:t xml:space="preserve">С кем я могу быть в своей истинной, королевской плотности. </w:t>
-        <w:br/>
-        <w:t>Вход на мою территорию — это привилегия. И эту привилегию нужно заслужить делами, стабильностью и ясным, открытым намерением». [Пауза 6 сек]</w:t>
+        <w:t>Вход на мою землю — это высокая привилегия. И она открывается только тем, кто приносит уважение, стабильность, искреннюю заботу и ясные поступки». [Пауза 7 сек]</w:t>
         <w:br/>
         <w:br/>
-        <w:t>Ваш Страж кивает. Он услышал приказ. Отныне фильтр включен. Ни один манипулятор, ни один инфантильный искатель материнского или отцовского тепла больше не переступит этот порог. Врата закрываются. С тяжелым, лязгающим звуком, который отдается в самой вашей груди, отсекая прошлое. [Пауза 5 сек]</w:t>
+        <w:t>Страж кивает. Фильтр активирован. Врата закрываются с тяжелым, надежным щелчком кованого замка, отсекая всех манипуляторов и случайных людей. [Пауза 5 сек]</w:t>
         <w:br/>
         <w:br/>
-        <w:t xml:space="preserve">И как только врата закрываются, золотая ось в вашем позвоночнике вспыхивает ярче. </w:t>
+        <w:t>[Закрытие Б2: Золотое сияние в теле]</w:t>
         <w:br/>
-        <w:t>Этот золотой свет разливается из позвоночника в ваше сердце. Он заполняет грудную клетку, выталкивая, вымывая старый спазм самообесценивания. Свет поднимается в горло, растворяя комки несказанных слов. Ваш голос отныне звучит из этой глубины — спокойно, ровно, без попыток кому-то угодить. Вы звучите, как сама Земля. [Пауза 5 сек]</w:t>
+        <w:t xml:space="preserve">И как только врата закрылись, золотая ось в твоем позвоночнике вспыхивает теплым светом. </w:t>
+        <w:br/>
+        <w:t xml:space="preserve">Этот свет разливается в грудную клетку, согревает сердце, растворяет старый зажим в горле. </w:t>
+        <w:br/>
+        <w:t>Твой голос обретает вес, глубину и спокойствие. Ты звучишь как сама уверенность. [Пауза 6 сек]</w:t>
         <w:br/>
         <w:br/>
-        <w:t xml:space="preserve">Вы стоите посреди своего цветущего сада. </w:t>
+        <w:t>[Закрытие А2: Цветущий сад и чистый горизонт]</w:t>
         <w:br/>
-        <w:t xml:space="preserve">Воздух свеж. Горизонт над стенами чист и открыт. </w:t>
+        <w:t xml:space="preserve">Ты стоишь посреди своего залитого солнцем поместья. </w:t>
         <w:br/>
-        <w:t>Положите руку себе на грудь, в центр грудины. Почувствуйте там тепло своей собственной ладони. Почувствуйте, как бьется ваше сердце — ровно, защищенно, сильно. Вы у себя есть. И вы себя больше не предадите. [Пауза 5 сек]</w:t>
+        <w:t xml:space="preserve">Воздух чист и свеж. Горизонт открыт. </w:t>
+        <w:br/>
+        <w:t>Положи руку на центр груди, почувствуй ровный, сильный ритм своего сердца. Ты у себя есть. И ты на своей земле. [Пауза 5 сек]</w:t>
         <w:br/>
         <w:br/>
-        <w:t xml:space="preserve">Сделайте глубокий, наполняющий вдох. </w:t>
+        <w:t>[Выход]</w:t>
         <w:br/>
-        <w:t xml:space="preserve">Потянитесь всем телом, чувствуя эту золотую ось внутри. </w:t>
+        <w:t xml:space="preserve">Сделай глубокий вдох, наполняя легкие силой... и долгий выдох. </w:t>
         <w:br/>
-        <w:t xml:space="preserve">Ощутите границы своего тела. </w:t>
+        <w:t xml:space="preserve">Потянись всем телом, сохраняя золотую ось внутри. </w:t>
         <w:br/>
-        <w:t>И когда будете готовы шагнуть в мир в новом статусе — откройте глаза. [Музыкальное завершение — Пауза 6 сек]</w:t>
+        <w:t>И открывай глаза хозяйкой своей жизни. [Музыкальное завершение — Пауза 6 сек]</w:t>
       </w:r>
     </w:p>
     <w:p>
@@ -362,15 +391,15 @@
           <w:rFonts w:ascii="Calibri" w:hAnsi="Calibri"/>
           <w:sz w:val="19"/>
         </w:rPr>
-        <w:t>• Главная мишень: Снятие невротического тремора, синдрома самозванца и суеты перед свиданием.</w:t>
+        <w:t>• Главная мишень: Снятие суеты, тремора и страха оценки («понравлюсь ли я?») перед свиданием или важной встречей.</w:t>
         <w:br/>
-        <w:t>• Соматический фокус: Тяжелая бархатная мантия на плечах, расслабление лицевых мышц и челюсти, брюшное замедленное дыхание.</w:t>
+        <w:t>• Соматический фокус: Тяжелая бархатная мантия на плечах, расслабление мимики лица и губ, брюшное замедленное дыхание, уверенная поступь.</w:t>
         <w:br/>
-        <w:t>• Терапевтический результат: Общение из взрослой исследовательской позиции: «подходит ли он мне?» вместо заискивающего желания понравиться.</w:t>
+        <w:t>• Терапевтический результат: Переключение из позиции «просителя на кастинге» в позицию «исследователя и суверена: подходит ли этот человек моему миру?».</w:t>
         <w:br/>
-        <w:t>• Параметры начитки: Хронометраж 8–9 мин (~750 слов) | Музыка FlowMusic 528 Hz, До мажор</w:t>
+        <w:t>• Параметры начитки: Хронометраж 8–10 мин (~800 слов) | Музыка FlowMusic 528 Hz, До мажор</w:t>
         <w:br/>
-        <w:t>• Архитектура Косички: А1 (Королевская бархатная мантия) ➔ Б1 (Снятие маски с лица и челюсти) ➔ В (Ядро: Позиция исследователя, врожденная ценность) ➔ Б2 (Гравитация в тазу и уверенные шаги) ➔ А2 (Ясный взгляд и полуулыбка силы)</w:t>
+        <w:t>• Архитектура Косички: А1 (Королевская бархатная мантия ценности) ➔ Б1 (Снятие маски с лица, тяжесть в плечах) ➔ В (Ядро: Позиция исследователя, врожденная гравитация ценности, снятие кастинга) ➔ Б2 (Уверенные шаги и устойчивость в тазу) ➔ А2 (Ясный взгляд и легкая полуулыбка силы)</w:t>
       </w:r>
     </w:p>
     <w:p>
@@ -382,65 +411,64 @@
           <w:rFonts w:ascii="Calibri" w:hAnsi="Calibri"/>
           <w:sz w:val="21"/>
         </w:rPr>
-        <w:t>[Музыкальное вступление — Пауза 4 сек]</w:t>
+        <w:t>[Музыкальное вступление: мягкий, обволакивающий фон 528 Гц — Пауза 4 сек]</w:t>
         <w:br/>
         <w:br/>
-        <w:t>Сядьте прямо. Найдите опору под ногами. [Пауза 3 сек]</w:t>
+        <w:t>Сядь прямо. Почувствуй стопами пол. [Пауза 3 сек]</w:t>
         <w:br/>
-        <w:t>Прямо сейчас, перед тем как выйти за дверь или подключиться к экрану, мы снимем с вас всю эту шелуху. Всю суету, весь тремор, всё это невротическое дребезжание, которое заставляет вас суетиться.</w:t>
+        <w:t xml:space="preserve">Прямо сейчас, перед тем как выйти за дверь или начать встречу, мы снимем с тебя всю суету. Весь этот мелкий тремор, спешку и внутреннее дребезжание. </w:t>
         <w:br/>
-        <w:t xml:space="preserve">Сделайте глубокий вдох животом. И медленный, ровный выдох через полуоткрытые губы, как будто вы выдыхаете через тонкую соломинку. </w:t>
+        <w:t>Сделай глубокий вдох животом... и длинный, плавный выдох через полуоткрытые губы. [Пауза 4 сек]</w:t>
         <w:br/>
-        <w:t>И еще раз. Вдох, расширяя ребра… И выдох, длинный, гасящий любую скорость. [Пауза 4 сек]</w:t>
+        <w:t>И еще раз. Вдох, расширяя ребра... И выдох, замедляющий любую спешку. [Пауза 4 сек]</w:t>
         <w:br/>
         <w:br/>
-        <w:t xml:space="preserve">Представьте, что прямо сейчас на ваши плечи ложится тяжелая, королевская мантия. </w:t>
+        <w:t xml:space="preserve">Представь, что прямо сейчас на твои плечи мягко опускается тяжелая, царственная мантия. </w:t>
         <w:br/>
-        <w:t xml:space="preserve">Она сшита из самого плотного, темного бархата, подбита теплым мехом. Почувствуйте ее физический вес на своих плечах. Эта тяжесть мгновенно осаживает вас. Она прижимает к земле вашу суету. </w:t>
+        <w:t xml:space="preserve">Она сшита из плотного, темного бархата и подбита мягким теплым мехом. </w:t>
         <w:br/>
-        <w:t>Вам больше некуда спешить. Люди в мантиях не бегают. Они ступают медленно, тяжело, оставляя глубокие следы в пространстве. [Пауза 5 сек]</w:t>
+        <w:t xml:space="preserve">Почувствуй ее реальный физический вес. Эта тяжесть приятно осаживает тебя. Она прижимает к земле всю ненужную суету. </w:t>
+        <w:br/>
+        <w:t>Люди в мантиях не бегают и не суетятся. Они ступают неспешно, весомо, наполняя собой пространство. [Пауза 5 сек]</w:t>
         <w:br/>
         <w:br/>
-        <w:t xml:space="preserve">Пройдитесь вниманием по лицу. </w:t>
+        <w:t xml:space="preserve">Пройдись вниманием по лицу. </w:t>
         <w:br/>
-        <w:t xml:space="preserve">Снимите маску «хорошей девочки» или «хорошего мальчика». Снимите маску «я всем нравлюсь». Расслабьте лоб. Разожмите челюсть. Уберите это напряженное ожидание из уголков глаз. Ваше лицо становится спокойным, расслабленным, слегка отстраненным. </w:t>
+        <w:t xml:space="preserve">Сними маску «хорошей девочки», маску заискивания и желания всем угодить. </w:t>
         <w:br/>
-        <w:t>Вам не нужно никого очаровывать. Вам не нужно сдавать экзамен. [Пауза 4 сек]</w:t>
+        <w:t xml:space="preserve">Разгладь лоб. Разомкни челюсти. Убери напряженное ожидание из глаз. Твое лицо становится спокойным, расслабленным и благородным. </w:t>
+        <w:br/>
+        <w:t>Тебе не нужно никого очаровывать. Тебе не нужно сдавать экзамен. [Пауза 5 сек]</w:t>
         <w:br/>
         <w:br/>
-        <w:t xml:space="preserve">Услышьте меня сейчас очень внимательно. </w:t>
+        <w:t>[Ядро: Позиция исследователя]</w:t>
         <w:br/>
-        <w:t xml:space="preserve">Вы не идете на кастинг. Вы не товар на полке, который ждет, чтобы его выбрали, оценили и купили. </w:t>
+        <w:t xml:space="preserve">Услышь меня очень внимательно. </w:t>
         <w:br/>
-        <w:t xml:space="preserve">Вы — главный акционер своей жизни. Вы — исследователь. </w:t>
+        <w:t xml:space="preserve">Ты идешь не на кастинг. Ты не товар на витрине, который ждет чьей-то оценки. </w:t>
         <w:br/>
-        <w:t xml:space="preserve">Это ВЫ идете смотреть. Это ВЫ идете изучать того человека, который сидит напротив. Подходит ли он для вашей вселенной? Выдержит ли он вашу плотность? Способен ли он говорить с вами на вашем языке? </w:t>
+        <w:t xml:space="preserve">Ты — главный акционер и автор своей жизни. Ты — исследователь. </w:t>
+        <w:br/>
+        <w:t xml:space="preserve">Это ТЫ идешь смотреть. Это ТЫ исследуешь человека напротив: </w:t>
+        <w:br/>
+        <w:t xml:space="preserve">«Кто ты? Подходишь ли ты моему миру? Безопасно ли с тобой? Способен ли ты на уважение и зрелость?». </w:t>
         <w:br/>
         <w:br/>
-        <w:t xml:space="preserve">Переключите тумблер в голове из позиции «Ой, а как я выгляжу, а понравлюсь ли я?» в позицию снайпера, исследователя, ученого. </w:t>
+        <w:t xml:space="preserve">Твоя ценность безусловна и врождена. Ее не нужно доказывать или заслуживать комплиментами. Она просто есть, как гравитация Земли. </w:t>
         <w:br/>
-        <w:t>«Кто ты? Что ты несешь в этот мир? Сможешь ли ты быть со мной рядом, не забирая мой свет?»</w:t>
-        <w:br/>
-        <w:t>Ваша ценность безусловна. Она врожденная. Ее не нужно подтверждать чужими взглядами, чужими комплиментами или лайками. Ваша ценность просто ЕСТЬ. Как факт. Как гравитация Земли. Никому в голову не приходит доказывать существование гравитации. Так же никому, и прежде всего вам, не нужно доказывать вашу ценность. [Пауза 5 сек]</w:t>
+        <w:t>Почувствуй эту теплую, тяжелую гравитацию в своем теле. Ты спокойна, как большая кошка на отдыхе: расслаблена, но в любую секунду владеешь ситуацией. [Пауза 6 сек]</w:t>
         <w:br/>
         <w:br/>
-        <w:t xml:space="preserve">Почувствуйте эту массивную, теплую гравитацию в центре своего таза. В своем животе. </w:t>
+        <w:t xml:space="preserve">Сейчас ты встанешь. Каждый твой шаг будет размеренным, устойчивым, полным достоинства. </w:t>
         <w:br/>
-        <w:t xml:space="preserve">Вы подобны большой, грациозной кошке, которая отдыхает на солнце. Она может быть расслабленной, но она в любой момент владеет ситуацией. </w:t>
+        <w:t xml:space="preserve">Твой голос будет звучать чуть глубже и спокойнее. </w:t>
+        <w:br/>
+        <w:t>Твой взгляд будет ясным и прямым, с легкой, едва заметной полуулыбкой человека, который знает главное: с тобой всё в полном порядке. [Пауза 4 сек]</w:t>
         <w:br/>
         <w:br/>
-        <w:t xml:space="preserve">Сейчас вы встанете. И каждый ваш шаг будет тяжелым, уверенным, полным достоинства. </w:t>
+        <w:t xml:space="preserve">Сделай глубокий вдох, ощущая вес мантии на плечах... и спокойный выдох. </w:t>
         <w:br/>
-        <w:t xml:space="preserve">Вы будете говорить чуть медленнее, чем обычно. </w:t>
-        <w:br/>
-        <w:t>Ваш взгляд будет ясным, прямым, с легкой полуулыбкой человека, который уже знает главную тайну: с вами ВСЁ ТАК. Вы в абсолютном порядке. [Пауза 4 сек]</w:t>
-        <w:br/>
-        <w:br/>
-        <w:t xml:space="preserve">Сделайте финальный, глубокий вдох. Наполните грудь этим знанием. </w:t>
-        <w:br/>
-        <w:t xml:space="preserve">Выдохните. Ощутите вес мантии на своих плечах. </w:t>
-        <w:br/>
-        <w:t>Откройте глаза. Вы готовы. Идите и возьмите своё. [Музыкальное завершение — Пауза 5 сек]</w:t>
+        <w:t>Открывай глаза. Иди и исследуй. [Музыкальное завершение — Пауза 5 сек]</w:t>
       </w:r>
     </w:p>
     <w:sectPr>

</xml_diff>

<commit_message>
audio: rewrite Meditation 1.1 in clean, soft, permissive hypnotic language matching Anatoly Fedorov authentic voice standard
</commit_message>
<xml_diff>
--- a/baza/медитации_и_аудио/МЕДИТАЦИИ_СЦЕНАРИЙ_1_Я_ВЫБИРАЮ_МАГИГ.docx
+++ b/baza/медитации_и_аудио/МЕДИТАЦИИ_СЦЕНАРИЙ_1_Я_ВЫБИРАЮ_МАГИГ.docx
@@ -69,15 +69,15 @@
           <w:rFonts w:ascii="Calibri" w:hAnsi="Calibri"/>
           <w:sz w:val="19"/>
         </w:rPr>
-        <w:t>• Главная мишень: Снятие адреналиновой зависимости от эмоциональных качелей (горячо/холодно) и идеализации недоступных партнеров.</w:t>
+        <w:t>• Главная мишень: Мягкое снятие тревожной спешки, остановка эмоциональных качелей, возвращение в точку внутреннего равновесия и покоя.</w:t>
         <w:br/>
-        <w:t>• Соматический фокус: Дыхание 3-2-6, расслабление жевательных мышц, опускание плеч, ощущение тяжести в кресле у камина, остановка маятника тревоги.</w:t>
+        <w:t>• Соматический фокус: Мягкий расслабленный взгляд, разглаживание лица, мягкая свободная челюсть, тепло в ладонях, опускание плеч, ровный естественный ритм дыхания.</w:t>
         <w:br/>
-        <w:t>• Терапевтический результат: Разрыв связки «тревога = страсть». Остановка внутреннего метронома спешки. Возврат энергии из фантазий в тело.</w:t>
+        <w:t>• Терапевтический результат: Мягкая остановка внутреннего маятника тревоги. Возврат энергии и душевного тепла себе. Обретение состояния уверенности и соматической опоры.</w:t>
         <w:br/>
-        <w:t>• Параметры начитки: Хронометраж 12–14 мин (~1050 слов) | Музыка FlowMusic 432 Hz, Ре минор | Ритм 3-2-6</w:t>
+        <w:t>• Параметры начитки: Хронометраж 11–13 мин (~950 слов) | Музыка FlowMusic 432 Hz, Ре минор | Чистый, мягкий, бархатный голос Анатолия Фёдорова</w:t>
         <w:br/>
-        <w:t>• Архитектура Косички: А1 (Старая мастерская часовщика в дождь) ➔ Б1 (Глубокое кожаное кресло и тепло очага) ➔ В (Ядро: Остановка гигантского бронзового маятника спешки в нулевой точке) ➔ Б2 (Тяжелое янтарное тепло наполняет позвоночник) ➔ А2 (Ровный пульс старых часов и горячий чай)</w:t>
+        <w:t>• Архитектура Косички: А1 (Старая мастерская часовщика в мягкий дождь) ➔ Б1 (Глубокое кресло у камина, тепло в ладонях) ➔ В (Ядро: Мягкая остановка маятника качелей в центре покоя, возврат ресурса) ➔ Б2 (Мягкое тепло наполняет тело, спина расправляется) ➔ А2 (Уют у очага, ровный пульс покоя и чистое возвращение)</w:t>
       </w:r>
     </w:p>
     <w:p>
@@ -89,119 +89,169 @@
           <w:rFonts w:ascii="Calibri" w:hAnsi="Calibri"/>
           <w:sz w:val="21"/>
         </w:rPr>
-        <w:t>[Музыкальное вступление: бархатный глубокий фон 432 Гц — Пауза 6 сек]</w:t>
+        <w:t>[Музыкальное вступление: мягкий, обволакивающий, теплый фон 432 Гц — Пауза 6 сек]</w:t>
         <w:br/>
         <w:br/>
-        <w:t>Устраивайся максимально удобно. [Пауза 3 сек]</w:t>
+        <w:t>Здравствуй. [Пауза 3 сек]</w:t>
         <w:br/>
-        <w:t>Так, чтобы твое тело могло полностью сдаться опоре. Почувствуй кресло или кровать под собой. Это не просто мебель — это фундамент, который держит тебя абсолютно надежно. Тебе больше не нужно напрягаться и держать себя. Отдай свой вес этой опоре. [Пауза 4 сек]</w:t>
+        <w:t>Позволь себе расположиться так, как тебе сейчас удобнее всего. [Пауза 4 сек]</w:t>
+        <w:br/>
+        <w:t>И прежде чем мы начнем... просто помни: это время принадлежит только тебе. [Пауза 4 сек]</w:t>
+        <w:br/>
+        <w:t xml:space="preserve">Найди место, где тебя никто не потревожит, отложи все, что отвлекает... </w:t>
+        <w:br/>
+        <w:t>И, наверное, не стоит слушать эту запись за рулем или когда ты занимаешься важными делами. [Пауза 4 сек]</w:t>
+        <w:br/>
+        <w:t>А лучше сейчас остановиться и позволить себе просто побыть собой. [Пауза 5 сек]</w:t>
         <w:br/>
         <w:br/>
-        <w:t>Сделай глубокий, медленный вдох носом... и протяжный, тяжелый выдох. [Пауза 4 сек]</w:t>
+        <w:t>Пусть эти минуты станут самым безопасным пространством для тебя. [Пауза 4 сек]</w:t>
         <w:br/>
-        <w:t xml:space="preserve">Сейчас мы настроим твой внутренний ритм. Дыхание три-два-шесть. </w:t>
+        <w:t>Где твое внимание мягко собирается внутри, и тебе не нужно ничего специально делать. [Пауза 4 сек]</w:t>
         <w:br/>
-        <w:t xml:space="preserve">Вдох на три счета: раз... два... три. </w:t>
+        <w:t>Ты можешь сидеть, чувствуя, как стопы спокойно касаются пола... [Пауза 3 сек]</w:t>
         <w:br/>
-        <w:t xml:space="preserve">Задержка: раз... два. </w:t>
+        <w:t xml:space="preserve">А можешь облокотиться на спинку кресла или даже лечь. </w:t>
         <w:br/>
-        <w:t>И длинный, освобождающий выдох на шесть: раз... два... три... четыре... пять... шесть. [Пауза 5 сек]</w:t>
-        <w:br/>
-        <w:t xml:space="preserve">Еще раз. Вдох: раз, два, три. </w:t>
-        <w:br/>
-        <w:t xml:space="preserve">Пауза: раз, два. </w:t>
-        <w:br/>
-        <w:t>И выдох: густой, медленный, отпускающий контроль... до самого конца. [Пауза 5 сек]</w:t>
+        <w:t>И пусть опора под тобой уже бережно и надежно держит тебя. [Пауза 5 сек]</w:t>
         <w:br/>
         <w:br/>
-        <w:t>С каждым выдохом теплая волна расслабления начинает свой путь от самой макушки. [Пауза 3 сек]</w:t>
+        <w:t>Сделай один чуть более глубокий, мягкий вдох носом... [Пауза 3 сек]</w:t>
         <w:br/>
-        <w:t xml:space="preserve">Расслабляется кожа головы. Тяжелеет лоб. Разглаживаются микроспазмы вокруг глаз. Твои веки становятся тяжелыми. Их просто не хочется открывать. </w:t>
+        <w:t>И длинный, спокойный, теплый выдох. [Пауза 4 сек]</w:t>
         <w:br/>
-        <w:t>Волна спускается ниже. Расслабляются скулы. Разожми челюсти. Позволь нижней челюсти слегка отвиснуть. Именно здесь, в этих жевательных мышцах, годами копились сдержанные слова, тревожные паузы и сомнения. Отпусти их. [Пауза 5 сек]</w:t>
-        <w:br/>
-        <w:t>Тепло ложится на плечи мягким, тяжелым пледом. Плечи опускаются на сантиметр вниз. Волна течет по рукам к самым кончикам пальцев. Кисти тяжелеют, наполняясь спокойным пульсом крови. Грудь дышит свободно. Живот мягкий и живой. Тело становится тяжелым, теплым, неподвижным монолитом. [Пауза 6 сек]</w:t>
+        <w:t>И еще один вдох... и свободное, легкое расслабление. [Пауза 5 сек]</w:t>
         <w:br/>
         <w:br/>
-        <w:t>[Нитка А1: Мастерская часовщика]</w:t>
+        <w:t xml:space="preserve">И пока внимание переносится внутрь, мышцы лица становятся чуть более спокойными. </w:t>
         <w:br/>
-        <w:t xml:space="preserve">И сквозь эту плотную тяжесть расслабления ты переносишься в особое пространство. </w:t>
+        <w:t>Лоб... виски... [Пауза 3 сек]</w:t>
         <w:br/>
-        <w:t xml:space="preserve">Ты стоишь на пороге старой мастерской часовщика на тихой европейской улочке. За окном хлещет плотный осенний дождь. Слышно, как тяжелые капли барабанят по стеклам. Но здесь, внутри — абсолютная, защищенная тишина. </w:t>
+        <w:t xml:space="preserve">Мягкий, расслабленный взгляд. </w:t>
         <w:br/>
-        <w:t xml:space="preserve">Ты делаешь шаг внутрь. Воздух густой, пахнет старым просушенным дубом, пчелиным воском и часовым маслом. </w:t>
-        <w:br/>
-        <w:t>Вокруг тебя — десятки старинных механических часов. Настенные, напольные, каминные. Они не создают суеты. Их мерное, глубокое тиканье создает симфонию стабильности. Век за веком, секунда за секундой. Медные маятники плавно качаются из стороны в сторону. Время здесь принадлежит только тебе. Оно течет густо, как янтарный мед. Ты садишься в массивное кожаное кресло у камина, в котором мерно потрескивают дубовые поленья. [Пауза 7 сек]</w:t>
+        <w:t>Если тебе хочется — ты можешь закрыть глаза. А можешь просто расслабить взгляд и позволить векам тяжело опуститься. [Пауза 5 сек]</w:t>
         <w:br/>
         <w:br/>
-        <w:t>[Нитка Б1: Соматическая опора кресла и камина]</w:t>
+        <w:t xml:space="preserve">Лицо разглаживается. Нижняя челюсть становится мягкой и свободной. </w:t>
         <w:br/>
-        <w:t xml:space="preserve">Сидя в этом кресле, почувствуй, как его спинка и подлокотники забирают всю накопившуюся усталость. </w:t>
+        <w:t xml:space="preserve">Плечи опускаются чуть ниже, отдавая тяжесть прошедшего дня. </w:t>
         <w:br/>
-        <w:t xml:space="preserve">Тысячи людей куда-то бегут, суетятся, спешат понравиться, ждут звонков... А здесь время остановилось. </w:t>
+        <w:t>Шея освобождается, а руки... ты можешь почувствовать, как руки становятся чуть тяжелее, а ладони — теплее. [Пауза 6 сек]</w:t>
         <w:br/>
-        <w:t xml:space="preserve">Твои стопы плотно стоят на массивных деревянных досках пола. </w:t>
+        <w:t xml:space="preserve">Дыхание само находит свой естественный, ровный, спокойный ритм. </w:t>
         <w:br/>
-        <w:t xml:space="preserve">Тепло от камина согревает колени, ладони, лицо. </w:t>
-        <w:br/>
-        <w:t>Внутри тебя наступает тишина, в которой нет места суете. [Пауза 6 сек]</w:t>
+        <w:t>С каждым выдохом суета и мысли могут спокойно протекать мимо, как осенние листья по тихой воде. [Пауза 6 сек]</w:t>
         <w:br/>
         <w:br/>
-        <w:t>[Нитка В: Ядро транса — Остановка маятника эмоциональных качелей]</w:t>
+        <w:t>[Нитка А1: Мастерская старинного часовщика]</w:t>
         <w:br/>
-        <w:t xml:space="preserve">И в этой тишине посмотри в центр комнаты. Там возвышается огромный, старинный бронзовый маятник. </w:t>
+        <w:t xml:space="preserve">И сквозь этот мягкий покой представь... что ты оказываешься в уединенном, теплом месте. </w:t>
         <w:br/>
-        <w:t xml:space="preserve">Это маятник твоих эмоциональных качелей. Он раскачивался годами: от эйфории к отчаянию, от иллюзий к холодной пустоте, от вспышки страсти к паническому ожиданию сообщения. </w:t>
+        <w:t xml:space="preserve">Это старая мастерская часовщика на тихой вечерней улочке. </w:t>
         <w:br/>
-        <w:t xml:space="preserve">Посмотри на него внимательно. Тебе казалось, что эта болтанка, этот адреналиновый надрыв — это и есть любовь. </w:t>
+        <w:t>За окном идет мягкий, тихий осенний дождь. Слышно, как капли мерно шелестят по стеклам, смывая всю внешнюю спешку. [Пауза 5 сек]</w:t>
         <w:br/>
-        <w:t>Но прямо сейчас, из этой тишины, осознай: это не любовь. Это просто спазм выживания. Это адреналиновая ломка нервной системы, которую ты принимала за страсть. Любовь не пахнет паникой. Любовь пахнет теплом, покоем и надежностью. [Пауза 6 сек]</w:t>
+        <w:t xml:space="preserve">А здесь, внутри — абсолютный уют, тепло и покой. </w:t>
+        <w:br/>
+        <w:t xml:space="preserve">Воздух чистый, пахнет нагретым деревом, пчелиным воском и сухими травами. </w:t>
+        <w:br/>
+        <w:t xml:space="preserve">Вокруг мерно дышат старинные часы. Настенные, напольные, каминные. </w:t>
+        <w:br/>
+        <w:t xml:space="preserve">Их неспешное, ровное тиканье создает атмосферу глубокой стабильности. </w:t>
+        <w:br/>
+        <w:t xml:space="preserve">Здесь время никуда не бежит. Оно течет плавно и спокойно. </w:t>
+        <w:br/>
+        <w:t>Ты устраиваешься в глубоком, мягком кресле у очага, где тихо потрескивают дрова, отдавая свое ласковое янтарное тепло. [Пауза 7 сек]</w:t>
         <w:br/>
         <w:br/>
-        <w:t xml:space="preserve">Ты встаешь из кресла. Твои шаги тверды и спокойны. </w:t>
+        <w:t>[Нитка Б1: Телесная опора и соматический покой]</w:t>
         <w:br/>
-        <w:t xml:space="preserve">Ты подходишь к этому огромному бронзовому маятнику. </w:t>
+        <w:t xml:space="preserve">Сидя в этом кресле, почувствуй, как его спинка бережно принимает всю твою усталость. </w:t>
         <w:br/>
-        <w:t xml:space="preserve">Ты вытягиваешь руки вперед и спокойно кладешь ладони на его тяжелый металл. </w:t>
+        <w:t xml:space="preserve">Тебе больше не нужно никуда спешить. Не нужно ничего доказывать или заслуживать. </w:t>
         <w:br/>
-        <w:t>И своей волей, своей взрослой силой ты останавливаешь его движение. [Пауза 4 сек]</w:t>
+        <w:t xml:space="preserve">Твои стопы мягко и надежно стоят на теплом деревянном полу. </w:t>
         <w:br/>
-        <w:t xml:space="preserve">Маятник замедляется... Амплитуда гаснет... </w:t>
+        <w:t xml:space="preserve">Ладони согреваются. </w:t>
         <w:br/>
-        <w:t xml:space="preserve">Остановка. </w:t>
-        <w:br/>
-        <w:t xml:space="preserve">Абсолютный центр. Нулевая точка. </w:t>
-        <w:br/>
-        <w:t>Качели остановлены навсегда. Механизм тревожной спешки отключен. Вся твоя энергия, которую ты тратила на обслуживание чужих качелей, мгновенно возвращается в твое тело. [Пауза 7 сек]</w:t>
+        <w:t>И все тело словно вспоминает свое природное право находиться в абсолютном покое и безопасности. [Пауза 7 сек]</w:t>
         <w:br/>
         <w:br/>
-        <w:t>[Закрытие Б2: Янтарное тепло в теле]</w:t>
+        <w:t>[Нитка В: Ядро транса — Остановка внутреннего маятника спешки]</w:t>
         <w:br/>
-        <w:t xml:space="preserve">Почувствуй, как плотная, теплая янтарная сила наполняет твои стопы. </w:t>
+        <w:t xml:space="preserve">И в этой тишине... обрати внимание, как посреди комнаты плавно движется красивый маятник. </w:t>
         <w:br/>
-        <w:t xml:space="preserve">Она поднимается по ногам, наполняет таз, течет вверх вдоль позвоночника. Позвонок за позвонком. </w:t>
+        <w:t xml:space="preserve">Это маятник внутренних качелей. </w:t>
         <w:br/>
-        <w:t>Она выжигает остатки сомнений, растворяет тревожный ком в груди. Твои плечи расправляются сами собой. Твоя осанка становится прямой и царственной. Ты наполнена спокойной, непоколебимой силой хозяйки своей жизни. [Пауза 6 сек]</w:t>
+        <w:t xml:space="preserve">Иногда в жизни этот ритм сбивался: то вверх — в тревожное ожидание, то вниз — в сомнения и усталость. </w:t>
+        <w:br/>
+        <w:t>Когда казалось, что нужно постоянно быть настороже, угадывать чужие реакции и подстраиваться. [Пауза 6 сек]</w:t>
+        <w:br/>
+        <w:t xml:space="preserve">Но прямо сейчас, из этой глубокой тишины, ты можешь почувствовать: </w:t>
+        <w:br/>
+        <w:t xml:space="preserve">Настоящее тепло и близость не требуют спешки. Они не создают тревоги. </w:t>
+        <w:br/>
+        <w:t>Настоящее рождается в спокойствии, уважении и ясности. [Пауза 6 сек]</w:t>
         <w:br/>
         <w:br/>
-        <w:t>[Закрытие А2: Возврат в кресло у очага]</w:t>
+        <w:t xml:space="preserve">И ты наблюдаешь, как этот маятник начинает замедлять свой ход. </w:t>
         <w:br/>
-        <w:t xml:space="preserve">Ты возвращаешься в свое кожаное кресло. В твоих руках — глиняная кружка со свежезаваренным чаем. </w:t>
+        <w:t>Его движение становится все мягче... плавнее... медленнее. [Пауза 5 сек]</w:t>
         <w:br/>
-        <w:t xml:space="preserve">Ты чувствуешь ее шершавое тепло ладонями. За окном шумит дождь, смывая прошлое. </w:t>
+        <w:t xml:space="preserve">Амплитуда затихает... </w:t>
         <w:br/>
-        <w:t>А в мастерской мерно, спокойно тикают часы. Тик-так... Это пульс твоего нового спокойствия. [Пауза 5 сек]</w:t>
+        <w:t xml:space="preserve">И маятник плавно останавливается в самом центре. </w:t>
+        <w:br/>
+        <w:t>В точке абсолютного равновесия и покоя. [Пауза 6 сек]</w:t>
+        <w:br/>
+        <w:t xml:space="preserve">Внутренние качели остановились. </w:t>
+        <w:br/>
+        <w:t xml:space="preserve">Вся твоя сила, все твое внимание и душевное тепло возвращаются к тебе. </w:t>
+        <w:br/>
+        <w:t>Ты возвращаешься к себе самой. [Пауза 7 сек]</w:t>
+        <w:br/>
+        <w:br/>
+        <w:t>[Закрытие Б2: Тепло и достоинство в теле]</w:t>
+        <w:br/>
+        <w:t xml:space="preserve">И от этой точки покоя по всему телу разливается мягкое, согревающее тепло. </w:t>
+        <w:br/>
+        <w:t xml:space="preserve">Оно наполняет стопы, поднимается по ногам, согревает спину. </w:t>
+        <w:br/>
+        <w:t xml:space="preserve">Твои плечи расправляются с тихим, естественным достоинством. </w:t>
+        <w:br/>
+        <w:t xml:space="preserve">Грудь дышит свободно и легко. </w:t>
+        <w:br/>
+        <w:t>Внутри появляется ощущение ясной, спокойной уверенности: ты хозяйка своего состояния. [Пауза 6 сек]</w:t>
+        <w:br/>
+        <w:br/>
+        <w:t>[Закрытие А2: Уют у очага и тихий пульс времени]</w:t>
+        <w:br/>
+        <w:t xml:space="preserve">Ты снова чувствуешь уютную мастерскую. </w:t>
+        <w:br/>
+        <w:t xml:space="preserve">В камине тихо тлеют рубиновые угли, согревая ладони. </w:t>
+        <w:br/>
+        <w:t xml:space="preserve">За окном стихает дождь. </w:t>
+        <w:br/>
+        <w:t xml:space="preserve">А старые часы продолжают свой ровный, убаюкивающий ход. Тик-так... </w:t>
+        <w:br/>
+        <w:t>Это спокойный, уверенный ритм твоей собственной жизни. [Пауза 6 сек]</w:t>
         <w:br/>
         <w:br/>
         <w:t>[Выход]</w:t>
         <w:br/>
-        <w:t xml:space="preserve">Сделай глубокий, наполняющий вдох... И медленный выдох. </w:t>
+        <w:t xml:space="preserve">Сохраняя это чувство глубокого покоя и внутренней устойчивости... </w:t>
         <w:br/>
-        <w:t xml:space="preserve">Пошевели пальцами рук и ног. Потянись всем телом, ощущая свою плотность и уверенность. </w:t>
+        <w:t>Сделай мягкий, наполняющий вдох... и свободный, освежающий выдох. [Пауза 4 сек]</w:t>
+        <w:br/>
+        <w:t xml:space="preserve">Пошевели пальцами рук и ног. </w:t>
+        <w:br/>
+        <w:t xml:space="preserve">Мягко потянись всем телом, чувствуя, как приятная бодрость и ясность наполняют тебя. </w:t>
         <w:br/>
         <w:t xml:space="preserve">И когда будешь готова — открывай глаза. </w:t>
         <w:br/>
-        <w:t>Ты в безопасности. Ты в своей силе. Маятник остановлен. [Музыкальное завершение — Пауза 6 сек]</w:t>
+        <w:t xml:space="preserve">Ты здесь. Ты спокойна. Ты на своей земле. </w:t>
+        <w:br/>
+        <w:t>Ты молодец. [Музыкальное завершение — Пауза 6 сек]</w:t>
       </w:r>
     </w:p>
     <w:p>

</xml_diff>

<commit_message>
audio: recompile all 12 master hypnosis sessions across 4 scenarios in clean, soft, permissive hypnotic voice with non-repeating metaphor systems
</commit_message>
<xml_diff>
--- a/baza/медитации_и_аудио/МЕДИТАЦИИ_СЦЕНАРИЙ_1_Я_ВЫБИРАЮ_МАГИГ.docx
+++ b/baza/медитации_и_аудио/МЕДИТАЦИИ_СЦЕНАРИЙ_1_Я_ВЫБИРАЮ_МАГИГ.docx
@@ -288,15 +288,15 @@
           <w:rFonts w:ascii="Calibri" w:hAnsi="Calibri"/>
           <w:sz w:val="19"/>
         </w:rPr>
-        <w:t>• Главная мишень: Ликвидация спасательства, отказ от роли эмоционального донора, обретение суверенного фильтра выбора.</w:t>
+        <w:t>• Главная мишень: Мягкое снятие привычки спасать и заслуживать любовь, обретение чувства суверенного достоинства и чистых границ.</w:t>
         <w:br/>
-        <w:t>• Соматический фокус: Золотая титановая ось в позвоночнике, расправление грудной клетки, ощущение нагретых солнцем каменных плит под ногами.</w:t>
+        <w:t>• Соматический фокус: Золотое мягкое тепло вдоль позвоночника, свободное дыхание грудью, расслабление лица, ощущение прогретых солнцем плит под стопами.</w:t>
         <w:br/>
-        <w:t>• Терапевтический результат: Формирование непроницаемых границ: «Я больше не спасаю, чтобы заслужить любовь. Вход на мою землю — только для равных».</w:t>
+        <w:t>• Терапевтический результат: Формирование естественного фильтра выбора: «Вход на мою землю — это подарок и радость для тех, кто приносит искренность и уважение».</w:t>
         <w:br/>
-        <w:t>• Параметры начитки: Хронометраж 12–14 мин (~1100 слов) | Музыка FlowMusic 963 Hz, Соль мажор</w:t>
+        <w:t>• Параметры начитки: Хронометраж 12–14 мин (~1050 слов) | Музыка FlowMusic 963 Hz, Соль мажор | Чистый, мягкий, бережный голос</w:t>
         <w:br/>
-        <w:t>• Архитектура Косички: А1 (Средиземноморское поместье за белыми стенами) ➔ Б1 (Золотая монолитная ось вдоль позвоночника) ➔ В (Ядро: Врата поместья, Внутренний Страж, сброс лохмотьев спасателя, провозглашение закона фильтра) ➔ Б2 (Золотое сияние в сердце и горле) ➔ А2 (Цветущий сад лимонов и открытый горизонт)</w:t>
+        <w:t>• Архитектура Косички: А1 (Средиземноморское поместье за белыми теплыми стенами) ➔ Б1 (Золотая теплая ось в позвоночнике) ➔ В (Ядро: Врата поместья, мудрый страж, мягкое отпускание роли спасателя, закон чистого выбора) ➔ Б2 (Золотое мягкое сияние в сердце и голосе) ➔ А2 (Цветущий сад лимонов и открытый горизонт)</w:t>
       </w:r>
     </w:p>
     <w:p>
@@ -308,103 +308,112 @@
           <w:rFonts w:ascii="Calibri" w:hAnsi="Calibri"/>
           <w:sz w:val="21"/>
         </w:rPr>
-        <w:t>[Музыкальное вступление: светлый, звонкий фон 963 Гц — Пауза 6 сек]</w:t>
+        <w:t>[Музыкальное вступление: светлый, звонкий, мягкий фон 963 Гц — Пауза 6 сек]</w:t>
         <w:br/>
         <w:br/>
-        <w:t>Закрой глаза. [Пауза 3 сек]</w:t>
+        <w:t>Здравствуй. [Пауза 3 сек]</w:t>
         <w:br/>
-        <w:t xml:space="preserve">Сделай глубокий, свободный вдох... и с протяжным выдохом позволь себе полностью расслабиться. </w:t>
+        <w:t>Позволь себе расположиться так, чтобы телу было по-настоящему уютно и свободно. [Пауза 4 сек]</w:t>
         <w:br/>
-        <w:t xml:space="preserve">Сегодня мы выстраиваем фундаментальную архитектуру твоего достоинства. </w:t>
+        <w:t>И пока дыхание течет легко и спокойно... помни: сейчас наступает время твоего возвращения к своей истинной силе. [Пауза 4 сек]</w:t>
         <w:br/>
-        <w:t>С каждым вдохом ты расширяешь свое внутреннее пространство, с каждым выдохом — отпускаешь чужие ожидания и старый страх быть отвергнутой. [Пауза 5 сек]</w:t>
+        <w:br/>
+        <w:t>Сделай мягкий, наполняющий вдох... и длинный, плавный выдох, отпуская все лишнее, все чужие сомнения и тревоги. [Пауза 5 сек]</w:t>
+        <w:br/>
+        <w:t xml:space="preserve">Почувствуй, как расслабляются веки... виски... щеки. </w:t>
+        <w:br/>
+        <w:t xml:space="preserve">Нижняя челюсть становится мягкой. </w:t>
+        <w:br/>
+        <w:t xml:space="preserve">Плечи плавно опускаются. </w:t>
+        <w:br/>
+        <w:t>Дыхание ровное, свободное, как тихий теплый ветер. [Пауза 6 сек]</w:t>
         <w:br/>
         <w:br/>
         <w:t>[Нитка А1: Средиземноморское поместье]</w:t>
         <w:br/>
-        <w:t xml:space="preserve">Представь, что ты стоишь на залитой полуденным солнцем земле. </w:t>
+        <w:t xml:space="preserve">И сквозь это приятное расслабление представь... что ты стоишь на залитой мягким утренним солнцем земле. </w:t>
         <w:br/>
-        <w:t xml:space="preserve">Это твое личное поместье. Твоя суверенная территория. </w:t>
+        <w:t xml:space="preserve">Это твое личное пространство. Твое поместье. </w:t>
         <w:br/>
-        <w:t xml:space="preserve">Под твоими ногами — теплые, нагретые солнцем белые каменные плиты из древнего известняка. Вокруг тебя — цветущие сады, в воздухе стоит густой аромат кипарисов, диких роз и спелых лимонов. </w:t>
+        <w:t xml:space="preserve">Под стопами — теплые, нагретые солнцем белые каменные плиты. </w:t>
         <w:br/>
-        <w:t>И главное — вокруг твоего поместья возвышаются мощные, неприступные белые каменные стены. Они сложены на века. Никто не может переступить эту границу без твоего согласия. Здесь правишь только ты. Здесь действуют только твои законы. [Пауза 7 сек]</w:t>
+        <w:t xml:space="preserve">Вокруг тихо цветут сады, воздух пахнет лавандой, кипарисами и спелыми лимонами. </w:t>
+        <w:br/>
+        <w:t xml:space="preserve">И вокруг твоего поместья возвышаются красивые, надежные белые стены. Они хранят твой покой. </w:t>
+        <w:br/>
+        <w:t>Здесь безопасно, здесь светло и уютно. Здесь правила создаешь только ты. [Пауза 7 сек]</w:t>
         <w:br/>
         <w:br/>
         <w:t>[Нитка Б1: Золотая ось достоинства]</w:t>
         <w:br/>
-        <w:t xml:space="preserve">Чтобы удерживать такое пространство, нужна безупречная внутренняя вертикаль. </w:t>
+        <w:t xml:space="preserve">И чтобы чувствовать эту красоту всем телом... </w:t>
         <w:br/>
         <w:t xml:space="preserve">Перенеси внимание на свой позвоночник. </w:t>
         <w:br/>
-        <w:t xml:space="preserve">Представь, как у самого основания копчика рождается капля расплавленного, сияющего золота. </w:t>
+        <w:t xml:space="preserve">Представь, как у самого основания зарождается мягкая, теплая золотая волна. </w:t>
         <w:br/>
-        <w:t xml:space="preserve">Она начинает медленно подниматься вверх. Позвонок за позвонком. Заполняя каждый сегмент позвоночника нерушимой плотностью. </w:t>
+        <w:t xml:space="preserve">Она плавно поднимается вверх, позвонок за позвонком, наполняя спину ровной, спокойной, естественной устойчивостью. </w:t>
         <w:br/>
-        <w:t xml:space="preserve">Твой позвоночник превращается в монолитную золотую ось. </w:t>
+        <w:t xml:space="preserve">Твоя осанка расправляется сама собой. </w:t>
         <w:br/>
-        <w:t>Твоя осанка выравнивается сама собой. Плечи расправляются, подбородок слегка приподнимается. Это не напряжение — это гравитация твоего царственного достоинства. Ты стоишь на своей земле, опираясь на свой нерушимый стержень. [Пауза 6 сек]</w:t>
+        <w:t>Это не напряжение — это легкое, свободное чувство собственного достоинства. Ты стоишь на своей земле, зная, кто ты есть. [Пауза 6 сек]</w:t>
         <w:br/>
         <w:br/>
-        <w:t>[Нитка В: Ядро транса — Врата поместья и Внутренний Страж]</w:t>
+        <w:t>[Нитка В: Ядро транса — Врата поместья и мудрый выбор]</w:t>
         <w:br/>
-        <w:t xml:space="preserve">Ты неспешно идешь по каменным плитам к главным воротам своего поместья. </w:t>
+        <w:t xml:space="preserve">Ты спокойно идешь по дорожке к главным воротам своего поместья. </w:t>
         <w:br/>
-        <w:t xml:space="preserve">Это массивные дубовые врата с коваными железными засовами. </w:t>
+        <w:t xml:space="preserve">Это красивые деревянные врата с коваными узорами. </w:t>
         <w:br/>
-        <w:t xml:space="preserve">Рядом с ними стоит твой Внутренний Страж — высокая, спокойная, мудрая фигура огромной силы. Он служит только тебе. Его задача — защищать чистоту твоей земли. </w:t>
+        <w:t xml:space="preserve">Рядом с ними стоит твой Внутренний Страж — мудрый, спокойный образ твоей зрелой силы. Он бережет твой душевный покой. </w:t>
         <w:br/>
         <w:br/>
-        <w:t xml:space="preserve">Вспомни: долгое время эти ворота были распахнуты настежь. </w:t>
+        <w:t xml:space="preserve">Вспомни: иногда казалось, что нужно быть удобной, помогать, лечить, отдавать свое тепло тем, кто этого не ценил, лишь бы заслужить немного любви. </w:t>
         <w:br/>
-        <w:t xml:space="preserve">Ты впускала тех, кого нужно было спасать, лечить, обогревать своей жизненной силой. Ты надевала на себя мокрые лохмотья «спасателя», надеясь, что за твою жертвенность тебя полюбят и оценят. </w:t>
+        <w:t xml:space="preserve">Но прямо сейчас ты можешь мягко снять с себя эту старую усталость, как старый дорожный плащ. </w:t>
         <w:br/>
-        <w:t xml:space="preserve">Посмотри на эти лохмотья прямо сейчас. Почувствуй, как они тянут тебя вниз, как они пахнут чужой беспомощностью и твоим истощением. </w:t>
+        <w:t xml:space="preserve">Сложи его и оставь позади. </w:t>
         <w:br/>
-        <w:t xml:space="preserve">Сними их. Сбрось их прямо на камни. </w:t>
-        <w:br/>
-        <w:t>Тебе больше не нужно никого спасать, чтобы доказать свою ценность. Твоя ценность абсолютна по праву рождения. [Пауза 6 сек]</w:t>
+        <w:t>Тебе больше не нужно заслуживать любовь или спасать кого-то во вред себе. Твоя ценность безусловна просто потому, что ты есть. [Пауза 6 сек]</w:t>
         <w:br/>
         <w:br/>
-        <w:t xml:space="preserve">Положи руку на кованый засов врат и громко, твердо провозгласи свой Новый Закон Выбора: </w:t>
+        <w:t xml:space="preserve">Положи руку на деревянные врата и произнеси внутри себя свое новое, спокойное правило: </w:t>
         <w:br/>
-        <w:t xml:space="preserve">«С этого момента на мою территорию заходят только те, кто равен мне по силе и зрелости. </w:t>
+        <w:t xml:space="preserve">«С этого момента в мое пространство приходят только те, кто приносит тепло, мир и уважение. </w:t>
         <w:br/>
-        <w:t xml:space="preserve">Я больше не реабилитационный центр для чужих травм. </w:t>
+        <w:t xml:space="preserve">Я выбираю отношения, где легко, радостно и взаимно. </w:t>
         <w:br/>
-        <w:t xml:space="preserve">Я больше не донор для эмоциональной пустоты. </w:t>
-        <w:br/>
-        <w:t>Вход на мою землю — это высокая привилегия. И она открывается только тем, кто приносит уважение, стабильность, искреннюю заботу и ясные поступки». [Пауза 7 сек]</w:t>
+        <w:t>Мой дом открыт для искренней заботы и настоящей близости». [Пауза 7 сек]</w:t>
         <w:br/>
         <w:br/>
-        <w:t>Страж кивает. Фильтр активирован. Врата закрываются с тяжелым, надежным щелчком кованого замка, отсекая всех манипуляторов и случайных людей. [Пауза 5 сек]</w:t>
+        <w:t>Врата мягко закрываются, надежно сохраняя твою гармонию. [Пауза 5 сек]</w:t>
         <w:br/>
         <w:br/>
-        <w:t>[Закрытие Б2: Золотое сияние в теле]</w:t>
+        <w:t>[Закрытие Б2: Золотое тепло в сердце]</w:t>
         <w:br/>
-        <w:t xml:space="preserve">И как только врата закрылись, золотая ось в твоем позвоночнике вспыхивает теплым светом. </w:t>
+        <w:t xml:space="preserve">И внутри груди разливается нежный, согревающий золотистый свет. </w:t>
         <w:br/>
-        <w:t xml:space="preserve">Этот свет разливается в грудную клетку, согревает сердце, растворяет старый зажим в горле. </w:t>
+        <w:t xml:space="preserve">Он наполняет сердце, поднимается к горлу, делая твой голос мягким, глубоким и уверенным. </w:t>
         <w:br/>
-        <w:t>Твой голос обретает вес, глубину и спокойствие. Ты звучишь как сама уверенность. [Пауза 6 сек]</w:t>
+        <w:t>Ты говоришь спокойно, без страха быть неуслышанной. [Пауза 6 сек]</w:t>
         <w:br/>
         <w:br/>
         <w:t>[Закрытие А2: Цветущий сад и чистый горизонт]</w:t>
         <w:br/>
-        <w:t xml:space="preserve">Ты стоишь посреди своего залитого солнцем поместья. </w:t>
+        <w:t xml:space="preserve">Ты стоишь посреди своего сада. </w:t>
         <w:br/>
-        <w:t xml:space="preserve">Воздух чист и свеж. Горизонт открыт. </w:t>
+        <w:t xml:space="preserve">Воздух прозрачен и свеж. Впереди — открытый, ясный горизонт. </w:t>
         <w:br/>
-        <w:t>Положи руку на центр груди, почувствуй ровный, сильный ритм своего сердца. Ты у себя есть. И ты на своей земле. [Пауза 5 сек]</w:t>
+        <w:t>Положи руку на сердце, почувствуй его спокойный, ровный ритм. Ты у себя есть. [Пауза 5 сек]</w:t>
         <w:br/>
         <w:br/>
         <w:t>[Выход]</w:t>
         <w:br/>
-        <w:t xml:space="preserve">Сделай глубокий вдох, наполняя легкие силой... и долгий выдох. </w:t>
+        <w:t xml:space="preserve">Сделай глубокий вдох... долгий, освежающий выдох. </w:t>
         <w:br/>
-        <w:t xml:space="preserve">Потянись всем телом, сохраняя золотую ось внутри. </w:t>
+        <w:t xml:space="preserve">Потянись всем телом, чувствуя приятную бодрость и свободу. </w:t>
         <w:br/>
-        <w:t>И открывай глаза хозяйкой своей жизни. [Музыкальное завершение — Пауза 6 сек]</w:t>
+        <w:t>И открывай глаза. Ты на своей земле. [Музыкальное завершение — Пауза 6 сек]</w:t>
       </w:r>
     </w:p>
     <w:p>
@@ -441,15 +450,15 @@
           <w:rFonts w:ascii="Calibri" w:hAnsi="Calibri"/>
           <w:sz w:val="19"/>
         </w:rPr>
-        <w:t>• Главная мишень: Снятие суеты, тремора и страха оценки («понравлюсь ли я?») перед свиданием или важной встречей.</w:t>
+        <w:t>• Главная мишень: Мягкое снятие суеты и волнения перед свиданием, переход в состояние расслабленной исследовательской уверенности.</w:t>
         <w:br/>
-        <w:t>• Соматический фокус: Тяжелая бархатная мантия на плечах, расслабление мимики лица и губ, брюшное замедленное дыхание, уверенная поступь.</w:t>
+        <w:t>• Соматический фокус: Мягкая бархатная мантия на плечах, свободная челюсть, тепло в ладонях и стопах, замедленный плавный выдох.</w:t>
         <w:br/>
-        <w:t>• Терапевтический результат: Переключение из позиции «просителя на кастинге» в позицию «исследователя и суверена: подходит ли этот человек моему миру?».</w:t>
+        <w:t>• Терапевтический результат: Ощущение собственной безусловной ценности: спокойный интерес вместо желания понравиться.</w:t>
         <w:br/>
-        <w:t>• Параметры начитки: Хронометраж 8–10 мин (~800 слов) | Музыка FlowMusic 528 Hz, До мажор</w:t>
+        <w:t>• Параметры начитки: Хронометраж 8–10 мин (~750 слов) | Музыка FlowMusic 528 Hz, До мажор</w:t>
         <w:br/>
-        <w:t>• Архитектура Косички: А1 (Королевская бархатная мантия ценности) ➔ Б1 (Снятие маски с лица, тяжесть в плечах) ➔ В (Ядро: Позиция исследователя, врожденная гравитация ценности, снятие кастинга) ➔ Б2 (Уверенные шаги и устойчивость в тазу) ➔ А2 (Ясный взгляд и легкая полуулыбка силы)</w:t>
+        <w:t>• Архитектура Косички: А1 (Теплая бархатная мантия на плечах) ➔ Б1 (Снятие напряжения с лица, свободное дыхание) ➔ В (Ядро: Позиция исследователя — «подходит ли мне этот человек?», врожденная ценность) ➔ Б2 (Уверенные мягкие шаги и тепло в ладонях) ➔ А2 (Ясный открытый взгляд и спокойная улыбка)</w:t>
       </w:r>
     </w:p>
     <w:p>
@@ -461,64 +470,70 @@
           <w:rFonts w:ascii="Calibri" w:hAnsi="Calibri"/>
           <w:sz w:val="21"/>
         </w:rPr>
-        <w:t>[Музыкальное вступление: мягкий, обволакивающий фон 528 Гц — Пауза 4 сек]</w:t>
+        <w:t>[Музыкальное вступление: нежный, обволакивающий фон 528 Гц — Пауза 4 сек]</w:t>
         <w:br/>
         <w:br/>
-        <w:t>Сядь прямо. Почувствуй стопами пол. [Пауза 3 сек]</w:t>
+        <w:t>Здравствуй. [Пауза 3 сек]</w:t>
         <w:br/>
-        <w:t xml:space="preserve">Прямо сейчас, перед тем как выйти за дверь или начать встречу, мы снимем с тебя всю суету. Весь этот мелкий тремор, спешку и внутреннее дребезжание. </w:t>
+        <w:t xml:space="preserve">Устройся удобно, почувствуй стопами пол. </w:t>
         <w:br/>
-        <w:t>Сделай глубокий вдох животом... и длинный, плавный выдох через полуоткрытые губы. [Пауза 4 сек]</w:t>
+        <w:t>Прямо сейчас, перед встречей, позволь себе сделать небольшую паузу и отпустить все лишнее волнение. [Пауза 4 сек]</w:t>
         <w:br/>
-        <w:t>И еще раз. Вдох, расширяя ребра... И выдох, замедляющий любую спешку. [Пауза 4 сек]</w:t>
+        <w:t>Сделай мягкий вдох животом... и длинный, плавный выдох через чуть приоткрытые губы. [Пауза 4 сек]</w:t>
+        <w:br/>
+        <w:t>И еще один вдох... и выдох, замедляющий любую спешку. [Пауза 4 сек]</w:t>
         <w:br/>
         <w:br/>
-        <w:t xml:space="preserve">Представь, что прямо сейчас на твои плечи мягко опускается тяжелая, царственная мантия. </w:t>
+        <w:t xml:space="preserve">Представь, что на твои плечи мягко ложится теплая, красивая бархатная мантия. </w:t>
         <w:br/>
-        <w:t xml:space="preserve">Она сшита из плотного, темного бархата и подбита мягким теплым мехом. </w:t>
+        <w:t xml:space="preserve">Она мягкая, уютная и имеет приятный, успокаивающий вес. </w:t>
         <w:br/>
-        <w:t xml:space="preserve">Почувствуй ее реальный физический вес. Эта тяжесть приятно осаживает тебя. Она прижимает к земле всю ненужную суету. </w:t>
+        <w:t xml:space="preserve">Эта тяжесть приятно заземляет тебя, снимая всю суету. </w:t>
         <w:br/>
-        <w:t>Люди в мантиях не бегают и не суетятся. Они ступают неспешно, весомо, наполняя собой пространство. [Пауза 5 сек]</w:t>
+        <w:t>Ты ступаешь мягко, спокойно и неспешно. [Пауза 5 сек]</w:t>
         <w:br/>
         <w:br/>
-        <w:t xml:space="preserve">Пройдись вниманием по лицу. </w:t>
+        <w:t xml:space="preserve">Обрати внимание на лицо. </w:t>
         <w:br/>
-        <w:t xml:space="preserve">Сними маску «хорошей девочки», маску заискивания и желания всем угодить. </w:t>
+        <w:t xml:space="preserve">Разгладь лоб... виски. </w:t>
         <w:br/>
-        <w:t xml:space="preserve">Разгладь лоб. Разомкни челюсти. Убери напряженное ожидание из глаз. Твое лицо становится спокойным, расслабленным и благородным. </w:t>
+        <w:t xml:space="preserve">Разомкни зубы, пусть нижняя челюсть станет абсолютно свободной. </w:t>
         <w:br/>
-        <w:t>Тебе не нужно никого очаровывать. Тебе не нужно сдавать экзамен. [Пауза 5 сек]</w:t>
+        <w:t xml:space="preserve">Сними любое напряжение из глаз. Взгляд становится мягким, открытым и ясным. </w:t>
+        <w:br/>
+        <w:t>Тебе не нужно сдавать экзамен или пытаться понравиться. [Пауза 5 сек]</w:t>
         <w:br/>
         <w:br/>
         <w:t>[Ядро: Позиция исследователя]</w:t>
         <w:br/>
-        <w:t xml:space="preserve">Услышь меня очень внимательно. </w:t>
+        <w:t xml:space="preserve">Услышь это сердцем: </w:t>
         <w:br/>
-        <w:t xml:space="preserve">Ты идешь не на кастинг. Ты не товар на витрине, который ждет чьей-то оценки. </w:t>
+        <w:t xml:space="preserve">Ты идешь на встречу не для того, чтобы тебя оценивали. </w:t>
         <w:br/>
-        <w:t xml:space="preserve">Ты — главный акционер и автор своей жизни. Ты — исследователь. </w:t>
+        <w:t xml:space="preserve">Ты идешь как исследователь своего собственного мира. </w:t>
         <w:br/>
-        <w:t xml:space="preserve">Это ТЫ идешь смотреть. Это ТЫ исследуешь человека напротив: </w:t>
+        <w:t xml:space="preserve">Это ты смотришь, слушаешь и чувствуешь: </w:t>
         <w:br/>
-        <w:t xml:space="preserve">«Кто ты? Подходишь ли ты моему миру? Безопасно ли с тобой? Способен ли ты на уважение и зрелость?». </w:t>
+        <w:t xml:space="preserve">«Интересен ли мне этот человек? Легко ли мне рядом с ним? Совпадают ли наши ценности?». </w:t>
         <w:br/>
         <w:br/>
-        <w:t xml:space="preserve">Твоя ценность безусловна и врождена. Ее не нужно доказывать или заслуживать комплиментами. Она просто есть, как гравитация Земли. </w:t>
+        <w:t xml:space="preserve">Твоя ценность уже с тобой — неизменная, врожденная, спокойная. </w:t>
         <w:br/>
-        <w:t>Почувствуй эту теплую, тяжелую гравитацию в своем теле. Ты спокойна, как большая кошка на отдыхе: расслаблена, но в любую секунду владеешь ситуацией. [Пауза 6 сек]</w:t>
+        <w:t>Тебе достаточно просто быть собой: настоящей, живой, внимательной. [Пауза 6 сек]</w:t>
         <w:br/>
         <w:br/>
-        <w:t xml:space="preserve">Сейчас ты встанешь. Каждый твой шаг будет размеренным, устойчивым, полным достоинства. </w:t>
+        <w:t xml:space="preserve">Сейчас ты сделаешь шаг в свой день. </w:t>
         <w:br/>
-        <w:t xml:space="preserve">Твой голос будет звучать чуть глубже и спокойнее. </w:t>
+        <w:t xml:space="preserve">Твоя походка будет легкой и уверенной. </w:t>
         <w:br/>
-        <w:t>Твой взгляд будет ясным и прямым, с легкой, едва заметной полуулыбкой человека, который знает главное: с тобой всё в полном порядке. [Пауза 4 сек]</w:t>
+        <w:t xml:space="preserve">Твой голос — спокойным и доброжелательным. </w:t>
+        <w:br/>
+        <w:t>А в глазах будет светиться легкая, теплая улыбка человека, который уверен в себе. [Пауза 5 сек]</w:t>
         <w:br/>
         <w:br/>
-        <w:t xml:space="preserve">Сделай глубокий вдох, ощущая вес мантии на плечах... и спокойный выдох. </w:t>
+        <w:t xml:space="preserve">Сделай глубокий вдох, ощути уют мантии на плечах... и мягкий выдох. </w:t>
         <w:br/>
-        <w:t>Открывай глаза. Иди и исследуй. [Музыкальное завершение — Пауза 5 сек]</w:t>
+        <w:t>Открывай глаза. Иди и наслаждайся встречей. [Музыкальное завершение — Пауза 5 сек]</w:t>
       </w:r>
     </w:p>
     <w:sectPr>

</xml_diff>